<commit_message>
Add Procedure column and General Test Procedure section
</commit_message>
<xml_diff>
--- a/HADI/3 BESS TEST.docx
+++ b/HADI/3 BESS TEST.docx
@@ -116,7 +116,16 @@
         <w:pStyle w:val="Heading1"/>
       </w:pPr>
       <w:r>
-        <w:t>General Prerequisites, Safety &amp; Acceptance Criteria</w:t>
+        <w:t>General Test Procedure</w:t>
+      </w:r>
+    </w:p>
+    <w:p>
+      <w:r>
+        <w:rPr>
+          <w:b w:val="0"/>
+          <w:i/>
+        </w:rPr>
+        <w:t>This general procedure applies to every test in the plan. The step-by-step actions specific to each test are given in the Procedure column of the section tables below.</w:t>
       </w:r>
     </w:p>
     <w:p>
@@ -124,7 +133,7 @@
         <w:pStyle w:val="Heading2"/>
       </w:pPr>
       <w:r>
-        <w:t>Prerequisites (verify before starting any section)</w:t>
+        <w:t>1. Prerequisites (verify before starting any section)</w:t>
       </w:r>
     </w:p>
     <w:p>
@@ -228,7 +237,99 @@
         <w:pStyle w:val="Heading2"/>
       </w:pPr>
       <w:r>
-        <w:t>Safety Checks</w:t>
+        <w:t>2. Test Execution Steps</w:t>
+      </w:r>
+    </w:p>
+    <w:p>
+      <w:pPr>
+        <w:pStyle w:val="ListBullet"/>
+      </w:pPr>
+      <w:r>
+        <w:rPr>
+          <w:b w:val="0"/>
+          <w:i w:val="0"/>
+        </w:rPr>
+        <w:t>Step 1: Confirm all prerequisites and safety checks for the section are satisfied.</w:t>
+      </w:r>
+    </w:p>
+    <w:p>
+      <w:pPr>
+        <w:pStyle w:val="ListBullet"/>
+      </w:pPr>
+      <w:r>
+        <w:rPr>
+          <w:b w:val="0"/>
+          <w:i w:val="0"/>
+        </w:rPr>
+        <w:t>Step 2: Record initial conditions (mode, SOC of each unit, load, grid import/export).</w:t>
+      </w:r>
+    </w:p>
+    <w:p>
+      <w:pPr>
+        <w:pStyle w:val="ListBullet"/>
+      </w:pPr>
+      <w:r>
+        <w:rPr>
+          <w:b w:val="0"/>
+          <w:i w:val="0"/>
+        </w:rPr>
+        <w:t>Step 3: Perform the actions listed in the Procedure column for the test, top to bottom. For grouped/incremental steps, move through each setpoint consecutively without returning to zero between steps.</w:t>
+      </w:r>
+    </w:p>
+    <w:p>
+      <w:pPr>
+        <w:pStyle w:val="ListBullet"/>
+      </w:pPr>
+      <w:r>
+        <w:rPr>
+          <w:b w:val="0"/>
+          <w:i w:val="0"/>
+        </w:rPr>
+        <w:t>Step 4: Observe and measure the actual response with the calibrated instrument.</w:t>
+      </w:r>
+    </w:p>
+    <w:p>
+      <w:pPr>
+        <w:pStyle w:val="ListBullet"/>
+      </w:pPr>
+      <w:r>
+        <w:rPr>
+          <w:b w:val="0"/>
+          <w:i w:val="0"/>
+        </w:rPr>
+        <w:t>Step 5: Compare the measured result against the Expected Results column.</w:t>
+      </w:r>
+    </w:p>
+    <w:p>
+      <w:pPr>
+        <w:pStyle w:val="ListBullet"/>
+      </w:pPr>
+      <w:r>
+        <w:rPr>
+          <w:b w:val="0"/>
+          <w:i w:val="0"/>
+        </w:rPr>
+        <w:t>Step 6: Mark the Approved column Pass/Fail (or Yes/No) and record measured values, deviations or observations in the Comments column.</w:t>
+      </w:r>
+    </w:p>
+    <w:p>
+      <w:pPr>
+        <w:pStyle w:val="ListBullet"/>
+      </w:pPr>
+      <w:r>
+        <w:rPr>
+          <w:b w:val="0"/>
+          <w:i w:val="0"/>
+        </w:rPr>
+        <w:t>Step 7: On any failure, abnormal alarm or protection trip, stop, log the event and apply the corrective action before re-testing.</w:t>
+      </w:r>
+    </w:p>
+    <w:p>
+      <w:pPr>
+        <w:pStyle w:val="Heading2"/>
+      </w:pPr>
+      <w:r>
+        <w:t>3. Safety Checks</w:t>
       </w:r>
     </w:p>
     <w:p>
@@ -296,7 +397,7 @@
         <w:pStyle w:val="Heading2"/>
       </w:pPr>
       <w:r>
-        <w:t>Acceptance Criteria</w:t>
+        <w:t>4. Acceptance Criteria</w:t>
       </w:r>
     </w:p>
     <w:p>
@@ -361,23 +462,6 @@
     </w:p>
     <w:p>
       <w:pPr>
-        <w:pStyle w:val="Heading2"/>
-      </w:pPr>
-      <w:r>
-        <w:t>How to Use the Tables</w:t>
-      </w:r>
-    </w:p>
-    <w:p>
-      <w:r>
-        <w:rPr>
-          <w:b w:val="0"/>
-          <w:i/>
-        </w:rPr>
-        <w:t>Each section below is a self-contained test table. Execute rows top-to-bottom; grouped incremental steps (e.g. discharge / charge / load sweeps) are performed consecutively without returning to zero between steps to save time. Record the outcome in the Approved column (Pass/Fail or Yes/No) and note any deviation in Comments.</w:t>
-      </w:r>
-    </w:p>
-    <w:p>
-      <w:pPr>
         <w:pStyle w:val="Heading1"/>
       </w:pPr>
       <w:r>
@@ -401,15 +485,16 @@
         <w:tblLook w:firstColumn="1" w:firstRow="1" w:lastColumn="0" w:lastRow="0" w:noHBand="0" w:noVBand="1" w:val="04A0"/>
       </w:tblPr>
       <w:tblGrid>
-        <w:gridCol w:w="2160"/>
-        <w:gridCol w:w="2160"/>
-        <w:gridCol w:w="2160"/>
-        <w:gridCol w:w="2160"/>
+        <w:gridCol w:w="1728"/>
+        <w:gridCol w:w="1728"/>
+        <w:gridCol w:w="1728"/>
+        <w:gridCol w:w="1728"/>
+        <w:gridCol w:w="1728"/>
       </w:tblGrid>
       <w:tr>
         <w:tc>
           <w:tcPr>
-            <w:tcW w:type="dxa" w:w="2736"/>
+            <w:tcW w:type="dxa" w:w="2016"/>
             <w:shd w:val="clear" w:color="auto" w:fill="1F4E79"/>
           </w:tcPr>
           <w:p>
@@ -429,7 +514,7 @@
         </w:tc>
         <w:tc>
           <w:tcPr>
-            <w:tcW w:type="dxa" w:w="4896"/>
+            <w:tcW w:type="dxa" w:w="3312"/>
             <w:shd w:val="clear" w:color="auto" w:fill="1F4E79"/>
           </w:tcPr>
           <w:p>
@@ -443,13 +528,13 @@
                 <w:color w:val="FFFFFF"/>
                 <w:sz w:val="20"/>
               </w:rPr>
-              <w:t>Expected Results</w:t>
+              <w:t>Procedure</w:t>
             </w:r>
           </w:p>
         </w:tc>
         <w:tc>
           <w:tcPr>
-            <w:tcW w:type="dxa" w:w="1296"/>
+            <w:tcW w:type="dxa" w:w="3744"/>
             <w:shd w:val="clear" w:color="auto" w:fill="1F4E79"/>
           </w:tcPr>
           <w:p>
@@ -463,13 +548,33 @@
                 <w:color w:val="FFFFFF"/>
                 <w:sz w:val="20"/>
               </w:rPr>
-              <w:t>Approved</w:t>
-            </w:r>
-          </w:p>
+              <w:t>Expected Results</w:t>
+            </w:r>
+          </w:p>
+        </w:tc>
+        <w:tc>
+          <w:tcPr>
+            <w:tcW w:type="dxa" w:w="1152"/>
+            <w:shd w:val="clear" w:color="auto" w:fill="1F4E79"/>
+          </w:tcPr>
           <w:p>
             <w:pPr>
               <w:jc w:val="center"/>
             </w:pPr>
+            <w:r/>
+            <w:r>
+              <w:rPr>
+                <w:b/>
+                <w:color w:val="FFFFFF"/>
+                <w:sz w:val="20"/>
+              </w:rPr>
+              <w:t>Approved</w:t>
+            </w:r>
+          </w:p>
+          <w:p>
+            <w:pPr>
+              <w:jc w:val="center"/>
+            </w:pPr>
             <w:r>
               <w:rPr>
                 <w:b/>
@@ -482,7 +587,7 @@
         </w:tc>
         <w:tc>
           <w:tcPr>
-            <w:tcW w:type="dxa" w:w="1728"/>
+            <w:tcW w:type="dxa" w:w="1440"/>
             <w:shd w:val="clear" w:color="auto" w:fill="1F4E79"/>
           </w:tcPr>
           <w:p>
@@ -504,7 +609,7 @@
       <w:tr>
         <w:tc>
           <w:tcPr>
-            <w:tcW w:type="dxa" w:w="2736"/>
+            <w:tcW w:type="dxa" w:w="2016"/>
           </w:tcPr>
           <w:p>
             <w:r/>
@@ -514,21 +619,12 @@
                 <w:sz w:val="20"/>
               </w:rPr>
               <w:t>1.1 PLC &amp; Units Start-up</w:t>
-            </w:r>
-          </w:p>
-          <w:p>
-            <w:r>
-              <w:rPr>
-                <w:b/>
-                <w:sz w:val="20"/>
-              </w:rPr>
-              <w:t>Power on the system (3 units); confirm PLC boot and communication with all 3 units and the grid power meter.</w:t>
             </w:r>
           </w:p>
         </w:tc>
         <w:tc>
           <w:tcPr>
-            <w:tcW w:type="dxa" w:w="4896"/>
+            <w:tcW w:type="dxa" w:w="3312"/>
           </w:tcPr>
           <w:p>
             <w:r/>
@@ -537,13 +633,28 @@
                 <w:b w:val="0"/>
                 <w:sz w:val="20"/>
               </w:rPr>
-              <w:t>PLC enters RUN mode with no faults. Communication established with all three units and the grid meter; all devices report Healthy. All three units become READY; no alarms; system available for operation.</w:t>
+              <w:t>Power on the system (3 units). Confirm PLC boots and establishes communication with all three units and the grid power meter.</w:t>
             </w:r>
           </w:p>
         </w:tc>
         <w:tc>
           <w:tcPr>
-            <w:tcW w:type="dxa" w:w="1296"/>
+            <w:tcW w:type="dxa" w:w="3744"/>
+          </w:tcPr>
+          <w:p>
+            <w:r/>
+            <w:r>
+              <w:rPr>
+                <w:b w:val="0"/>
+                <w:sz w:val="20"/>
+              </w:rPr>
+              <w:t>PLC enters RUN mode with no faults. Communication established with all three units and the grid meter; all devices report Healthy. All three units become READY; no alarms; system available for operation.</w:t>
+            </w:r>
+          </w:p>
+        </w:tc>
+        <w:tc>
+          <w:tcPr>
+            <w:tcW w:type="dxa" w:w="1152"/>
           </w:tcPr>
           <w:p>
             <w:pPr>
@@ -560,7 +671,7 @@
         </w:tc>
         <w:tc>
           <w:tcPr>
-            <w:tcW w:type="dxa" w:w="1728"/>
+            <w:tcW w:type="dxa" w:w="1440"/>
           </w:tcPr>
           <w:p>
             <w:r/>
@@ -576,7 +687,7 @@
       <w:tr>
         <w:tc>
           <w:tcPr>
-            <w:tcW w:type="dxa" w:w="2736"/>
+            <w:tcW w:type="dxa" w:w="2016"/>
           </w:tcPr>
           <w:p>
             <w:r/>
@@ -586,21 +697,12 @@
                 <w:sz w:val="20"/>
               </w:rPr>
               <w:t>1.2 Grid Meter Communication Loss &amp; Recovery</w:t>
-            </w:r>
-          </w:p>
-          <w:p>
-            <w:r>
-              <w:rPr>
-                <w:b/>
-                <w:sz w:val="20"/>
-              </w:rPr>
-              <w:t>Disconnect the grid meter, then reconnect it.</w:t>
             </w:r>
           </w:p>
         </w:tc>
         <w:tc>
           <w:tcPr>
-            <w:tcW w:type="dxa" w:w="4896"/>
+            <w:tcW w:type="dxa" w:w="3312"/>
           </w:tcPr>
           <w:p>
             <w:r/>
@@ -609,13 +711,28 @@
                 <w:b w:val="0"/>
                 <w:sz w:val="20"/>
               </w:rPr>
-              <w:t>On disconnect: PLC detects the communication failure, generates an alarm and enters the configured fallback mode. On reconnect: normal operation resumes automatically.</w:t>
+              <w:t>Disconnect the grid meter, then reconnect it.</w:t>
             </w:r>
           </w:p>
         </w:tc>
         <w:tc>
           <w:tcPr>
-            <w:tcW w:type="dxa" w:w="1296"/>
+            <w:tcW w:type="dxa" w:w="3744"/>
+          </w:tcPr>
+          <w:p>
+            <w:r/>
+            <w:r>
+              <w:rPr>
+                <w:b w:val="0"/>
+                <w:sz w:val="20"/>
+              </w:rPr>
+              <w:t>On disconnect: PLC detects the communication failure, generates an alarm and enters the configured fallback mode. On reconnect: normal operation resumes automatically.</w:t>
+            </w:r>
+          </w:p>
+        </w:tc>
+        <w:tc>
+          <w:tcPr>
+            <w:tcW w:type="dxa" w:w="1152"/>
           </w:tcPr>
           <w:p>
             <w:pPr>
@@ -632,7 +749,7 @@
         </w:tc>
         <w:tc>
           <w:tcPr>
-            <w:tcW w:type="dxa" w:w="1728"/>
+            <w:tcW w:type="dxa" w:w="1440"/>
           </w:tcPr>
           <w:p>
             <w:r/>
@@ -648,7 +765,7 @@
       <w:tr>
         <w:tc>
           <w:tcPr>
-            <w:tcW w:type="dxa" w:w="2736"/>
+            <w:tcW w:type="dxa" w:w="2016"/>
           </w:tcPr>
           <w:p>
             <w:r/>
@@ -658,21 +775,12 @@
                 <w:sz w:val="20"/>
               </w:rPr>
               <w:t>1.3 Disable Individual Unit</w:t>
-            </w:r>
-          </w:p>
-          <w:p>
-            <w:r>
-              <w:rPr>
-                <w:b/>
-                <w:sz w:val="20"/>
-              </w:rPr>
-              <w:t>Disable Unit 2 while Units 1 and 3 remain enabled.</w:t>
             </w:r>
           </w:p>
         </w:tc>
         <w:tc>
           <w:tcPr>
-            <w:tcW w:type="dxa" w:w="4896"/>
+            <w:tcW w:type="dxa" w:w="3312"/>
           </w:tcPr>
           <w:p>
             <w:r/>
@@ -681,13 +789,28 @@
                 <w:b w:val="0"/>
                 <w:sz w:val="20"/>
               </w:rPr>
-              <w:t>Unit 2 shuts down safely; Units 1 and 3 remain online; PLC updates the available capacity accordingly.</w:t>
+              <w:t>Disable Unit 2 while Units 1 and 3 remain enabled.</w:t>
             </w:r>
           </w:p>
         </w:tc>
         <w:tc>
           <w:tcPr>
-            <w:tcW w:type="dxa" w:w="1296"/>
+            <w:tcW w:type="dxa" w:w="3744"/>
+          </w:tcPr>
+          <w:p>
+            <w:r/>
+            <w:r>
+              <w:rPr>
+                <w:b w:val="0"/>
+                <w:sz w:val="20"/>
+              </w:rPr>
+              <w:t>Unit 2 shuts down safely; Units 1 and 3 remain online; PLC updates the available capacity accordingly.</w:t>
+            </w:r>
+          </w:p>
+        </w:tc>
+        <w:tc>
+          <w:tcPr>
+            <w:tcW w:type="dxa" w:w="1152"/>
           </w:tcPr>
           <w:p>
             <w:pPr>
@@ -704,7 +827,7 @@
         </w:tc>
         <w:tc>
           <w:tcPr>
-            <w:tcW w:type="dxa" w:w="1728"/>
+            <w:tcW w:type="dxa" w:w="1440"/>
           </w:tcPr>
           <w:p>
             <w:r/>
@@ -720,7 +843,7 @@
       <w:tr>
         <w:tc>
           <w:tcPr>
-            <w:tcW w:type="dxa" w:w="2736"/>
+            <w:tcW w:type="dxa" w:w="2016"/>
           </w:tcPr>
           <w:p>
             <w:r/>
@@ -730,21 +853,12 @@
                 <w:sz w:val="20"/>
               </w:rPr>
               <w:t>1.4 Disable Complete System</w:t>
-            </w:r>
-          </w:p>
-          <w:p>
-            <w:r>
-              <w:rPr>
-                <w:b/>
-                <w:sz w:val="20"/>
-              </w:rPr>
-              <w:t>Issue the Disable command to the whole system.</w:t>
             </w:r>
           </w:p>
         </w:tc>
         <w:tc>
           <w:tcPr>
-            <w:tcW w:type="dxa" w:w="4896"/>
+            <w:tcW w:type="dxa" w:w="3312"/>
           </w:tcPr>
           <w:p>
             <w:r/>
@@ -753,13 +867,28 @@
                 <w:b w:val="0"/>
                 <w:sz w:val="20"/>
               </w:rPr>
-              <w:t>All units stop; battery contactors open; system enters Standby.</w:t>
+              <w:t>Issue the Disable command to the whole system.</w:t>
             </w:r>
           </w:p>
         </w:tc>
         <w:tc>
           <w:tcPr>
-            <w:tcW w:type="dxa" w:w="1296"/>
+            <w:tcW w:type="dxa" w:w="3744"/>
+          </w:tcPr>
+          <w:p>
+            <w:r/>
+            <w:r>
+              <w:rPr>
+                <w:b w:val="0"/>
+                <w:sz w:val="20"/>
+              </w:rPr>
+              <w:t>All units stop; battery contactors open; system enters Standby.</w:t>
+            </w:r>
+          </w:p>
+        </w:tc>
+        <w:tc>
+          <w:tcPr>
+            <w:tcW w:type="dxa" w:w="1152"/>
           </w:tcPr>
           <w:p>
             <w:pPr>
@@ -776,7 +905,7 @@
         </w:tc>
         <w:tc>
           <w:tcPr>
-            <w:tcW w:type="dxa" w:w="1728"/>
+            <w:tcW w:type="dxa" w:w="1440"/>
           </w:tcPr>
           <w:p>
             <w:r/>
@@ -792,7 +921,7 @@
       <w:tr>
         <w:tc>
           <w:tcPr>
-            <w:tcW w:type="dxa" w:w="2736"/>
+            <w:tcW w:type="dxa" w:w="2016"/>
           </w:tcPr>
           <w:p>
             <w:r/>
@@ -802,21 +931,12 @@
                 <w:sz w:val="20"/>
               </w:rPr>
               <w:t>1.5 Emergency Stop &amp; Restart</w:t>
-            </w:r>
-          </w:p>
-          <w:p>
-            <w:r>
-              <w:rPr>
-                <w:b/>
-                <w:sz w:val="20"/>
-              </w:rPr>
-              <w:t>Activate Emergency Stop, then reset the E-Stop and re-enable the system.</w:t>
             </w:r>
           </w:p>
         </w:tc>
         <w:tc>
           <w:tcPr>
-            <w:tcW w:type="dxa" w:w="4896"/>
+            <w:tcW w:type="dxa" w:w="3312"/>
           </w:tcPr>
           <w:p>
             <w:r/>
@@ -825,13 +945,28 @@
                 <w:b w:val="0"/>
                 <w:sz w:val="20"/>
               </w:rPr>
-              <w:t>On E-Stop: all PCS stop immediately, battery isolated, alarm generated, manual reset required. After reset &amp; enable: PLC clears the alarm, all three units restart normally and the system returns to READY.</w:t>
+              <w:t>Activate Emergency Stop. Then reset the E-Stop and re-enable the system.</w:t>
             </w:r>
           </w:p>
         </w:tc>
         <w:tc>
           <w:tcPr>
-            <w:tcW w:type="dxa" w:w="1296"/>
+            <w:tcW w:type="dxa" w:w="3744"/>
+          </w:tcPr>
+          <w:p>
+            <w:r/>
+            <w:r>
+              <w:rPr>
+                <w:b w:val="0"/>
+                <w:sz w:val="20"/>
+              </w:rPr>
+              <w:t>On E-Stop: all PCS stop immediately, battery isolated, alarm generated, manual reset required. After reset &amp; enable: PLC clears the alarm, all three units restart normally and the system returns to READY.</w:t>
+            </w:r>
+          </w:p>
+        </w:tc>
+        <w:tc>
+          <w:tcPr>
+            <w:tcW w:type="dxa" w:w="1152"/>
           </w:tcPr>
           <w:p>
             <w:pPr>
@@ -848,7 +983,7 @@
         </w:tc>
         <w:tc>
           <w:tcPr>
-            <w:tcW w:type="dxa" w:w="1728"/>
+            <w:tcW w:type="dxa" w:w="1440"/>
           </w:tcPr>
           <w:p>
             <w:r/>
@@ -897,15 +1032,16 @@
         <w:tblLook w:firstColumn="1" w:firstRow="1" w:lastColumn="0" w:lastRow="0" w:noHBand="0" w:noVBand="1" w:val="04A0"/>
       </w:tblPr>
       <w:tblGrid>
-        <w:gridCol w:w="2160"/>
-        <w:gridCol w:w="2160"/>
-        <w:gridCol w:w="2160"/>
-        <w:gridCol w:w="2160"/>
+        <w:gridCol w:w="1728"/>
+        <w:gridCol w:w="1728"/>
+        <w:gridCol w:w="1728"/>
+        <w:gridCol w:w="1728"/>
+        <w:gridCol w:w="1728"/>
       </w:tblGrid>
       <w:tr>
         <w:tc>
           <w:tcPr>
-            <w:tcW w:type="dxa" w:w="2736"/>
+            <w:tcW w:type="dxa" w:w="2016"/>
             <w:shd w:val="clear" w:color="auto" w:fill="1F4E79"/>
           </w:tcPr>
           <w:p>
@@ -925,7 +1061,7 @@
         </w:tc>
         <w:tc>
           <w:tcPr>
-            <w:tcW w:type="dxa" w:w="4896"/>
+            <w:tcW w:type="dxa" w:w="3312"/>
             <w:shd w:val="clear" w:color="auto" w:fill="1F4E79"/>
           </w:tcPr>
           <w:p>
@@ -939,13 +1075,13 @@
                 <w:color w:val="FFFFFF"/>
                 <w:sz w:val="20"/>
               </w:rPr>
-              <w:t>Expected Results</w:t>
+              <w:t>Procedure</w:t>
             </w:r>
           </w:p>
         </w:tc>
         <w:tc>
           <w:tcPr>
-            <w:tcW w:type="dxa" w:w="1296"/>
+            <w:tcW w:type="dxa" w:w="3744"/>
             <w:shd w:val="clear" w:color="auto" w:fill="1F4E79"/>
           </w:tcPr>
           <w:p>
@@ -959,13 +1095,33 @@
                 <w:color w:val="FFFFFF"/>
                 <w:sz w:val="20"/>
               </w:rPr>
-              <w:t>Approved</w:t>
-            </w:r>
-          </w:p>
+              <w:t>Expected Results</w:t>
+            </w:r>
+          </w:p>
+        </w:tc>
+        <w:tc>
+          <w:tcPr>
+            <w:tcW w:type="dxa" w:w="1152"/>
+            <w:shd w:val="clear" w:color="auto" w:fill="1F4E79"/>
+          </w:tcPr>
           <w:p>
             <w:pPr>
               <w:jc w:val="center"/>
             </w:pPr>
+            <w:r/>
+            <w:r>
+              <w:rPr>
+                <w:b/>
+                <w:color w:val="FFFFFF"/>
+                <w:sz w:val="20"/>
+              </w:rPr>
+              <w:t>Approved</w:t>
+            </w:r>
+          </w:p>
+          <w:p>
+            <w:pPr>
+              <w:jc w:val="center"/>
+            </w:pPr>
             <w:r>
               <w:rPr>
                 <w:b/>
@@ -978,7 +1134,7 @@
         </w:tc>
         <w:tc>
           <w:tcPr>
-            <w:tcW w:type="dxa" w:w="1728"/>
+            <w:tcW w:type="dxa" w:w="1440"/>
             <w:shd w:val="clear" w:color="auto" w:fill="1F4E79"/>
           </w:tcPr>
           <w:p>
@@ -1000,7 +1156,7 @@
       <w:tr>
         <w:tc>
           <w:tcPr>
-            <w:tcW w:type="dxa" w:w="2736"/>
+            <w:tcW w:type="dxa" w:w="2016"/>
           </w:tcPr>
           <w:p>
             <w:r/>
@@ -1010,21 +1166,12 @@
                 <w:sz w:val="20"/>
               </w:rPr>
               <w:t>2.1 Manual Mode Selection</w:t>
-            </w:r>
-          </w:p>
-          <w:p>
-            <w:r>
-              <w:rPr>
-                <w:b/>
-                <w:sz w:val="20"/>
-              </w:rPr>
-              <w:t>Enable all three units, select Manual Mode, verify Peak Shaving is disabled.</w:t>
             </w:r>
           </w:p>
         </w:tc>
         <w:tc>
           <w:tcPr>
-            <w:tcW w:type="dxa" w:w="4896"/>
+            <w:tcW w:type="dxa" w:w="3312"/>
           </w:tcPr>
           <w:p>
             <w:r/>
@@ -1033,13 +1180,28 @@
                 <w:b w:val="0"/>
                 <w:sz w:val="20"/>
               </w:rPr>
-              <w:t>Manual Mode active; Peak Shaving disabled; power setpoint accepted; System Ready indication active.</w:t>
+              <w:t>Enable all three units, select Manual Mode, verify Peak Shaving is disabled.</w:t>
             </w:r>
           </w:p>
         </w:tc>
         <w:tc>
           <w:tcPr>
-            <w:tcW w:type="dxa" w:w="1296"/>
+            <w:tcW w:type="dxa" w:w="3744"/>
+          </w:tcPr>
+          <w:p>
+            <w:r/>
+            <w:r>
+              <w:rPr>
+                <w:b w:val="0"/>
+                <w:sz w:val="20"/>
+              </w:rPr>
+              <w:t>Manual Mode active; Peak Shaving disabled; power setpoint accepted; System Ready indication active.</w:t>
+            </w:r>
+          </w:p>
+        </w:tc>
+        <w:tc>
+          <w:tcPr>
+            <w:tcW w:type="dxa" w:w="1152"/>
           </w:tcPr>
           <w:p>
             <w:pPr>
@@ -1056,7 +1218,7 @@
         </w:tc>
         <w:tc>
           <w:tcPr>
-            <w:tcW w:type="dxa" w:w="1728"/>
+            <w:tcW w:type="dxa" w:w="1440"/>
           </w:tcPr>
           <w:p>
             <w:r/>
@@ -1072,7 +1234,7 @@
       <w:tr>
         <w:tc>
           <w:tcPr>
-            <w:tcW w:type="dxa" w:w="2736"/>
+            <w:tcW w:type="dxa" w:w="2016"/>
           </w:tcPr>
           <w:p>
             <w:r/>
@@ -1082,21 +1244,12 @@
                 <w:sz w:val="20"/>
               </w:rPr>
               <w:t>2.2 Zero Power Command</w:t>
-            </w:r>
-          </w:p>
-          <w:p>
-            <w:r>
-              <w:rPr>
-                <w:b/>
-                <w:sz w:val="20"/>
-              </w:rPr>
-              <w:t>Set manual power command = 0 kW.</w:t>
             </w:r>
           </w:p>
         </w:tc>
         <w:tc>
           <w:tcPr>
-            <w:tcW w:type="dxa" w:w="4896"/>
+            <w:tcW w:type="dxa" w:w="3312"/>
           </w:tcPr>
           <w:p>
             <w:r/>
@@ -1105,13 +1258,28 @@
                 <w:b w:val="0"/>
                 <w:sz w:val="20"/>
               </w:rPr>
-              <w:t>Total BESS power = 0 kW; BESS remains online; no charging or discharging; no alarms.</w:t>
+              <w:t>Set manual power command = 0 kW.</w:t>
             </w:r>
           </w:p>
         </w:tc>
         <w:tc>
           <w:tcPr>
-            <w:tcW w:type="dxa" w:w="1296"/>
+            <w:tcW w:type="dxa" w:w="3744"/>
+          </w:tcPr>
+          <w:p>
+            <w:r/>
+            <w:r>
+              <w:rPr>
+                <w:b w:val="0"/>
+                <w:sz w:val="20"/>
+              </w:rPr>
+              <w:t>Total BESS power = 0 kW; BESS remains online; no charging or discharging; no alarms.</w:t>
+            </w:r>
+          </w:p>
+        </w:tc>
+        <w:tc>
+          <w:tcPr>
+            <w:tcW w:type="dxa" w:w="1152"/>
           </w:tcPr>
           <w:p>
             <w:pPr>
@@ -1128,7 +1296,7 @@
         </w:tc>
         <w:tc>
           <w:tcPr>
-            <w:tcW w:type="dxa" w:w="1728"/>
+            <w:tcW w:type="dxa" w:w="1440"/>
           </w:tcPr>
           <w:p>
             <w:r/>
@@ -1144,7 +1312,7 @@
       <w:tr>
         <w:tc>
           <w:tcPr>
-            <w:tcW w:type="dxa" w:w="2736"/>
+            <w:tcW w:type="dxa" w:w="2016"/>
           </w:tcPr>
           <w:p>
             <w:r/>
@@ -1154,30 +1322,12 @@
                 <w:sz w:val="20"/>
               </w:rPr>
               <w:t>2.3 Incremental Discharge Sweep (grouped)</w:t>
-            </w:r>
-          </w:p>
-          <w:p>
-            <w:r>
-              <w:rPr>
-                <w:b/>
-                <w:sz w:val="20"/>
-              </w:rPr>
-              <w:t>Without returning to zero, step the manual discharge command through:</w:t>
-            </w:r>
-          </w:p>
-          <w:p>
-            <w:r>
-              <w:rPr>
-                <w:b/>
-                <w:sz w:val="20"/>
-              </w:rPr>
-              <w:t>30 → 60 → 90 → 150 → 240 → 300 kW.</w:t>
             </w:r>
           </w:p>
         </w:tc>
         <w:tc>
           <w:tcPr>
-            <w:tcW w:type="dxa" w:w="4896"/>
+            <w:tcW w:type="dxa" w:w="3312"/>
           </w:tcPr>
           <w:p>
             <w:r/>
@@ -1186,7 +1336,7 @@
                 <w:b w:val="0"/>
                 <w:sz w:val="20"/>
               </w:rPr>
-              <w:t>Power is shared equally across the three units at each step, actual power within ±2%, output stable:</w:t>
+              <w:t>Without returning to zero, step the manual discharge command through:</w:t>
             </w:r>
           </w:p>
           <w:p>
@@ -1195,58 +1345,82 @@
                 <w:b w:val="0"/>
                 <w:sz w:val="20"/>
               </w:rPr>
-              <w:t>- 30 kW: 10 / 10 / 10 kW</w:t>
-            </w:r>
-          </w:p>
-          <w:p>
-            <w:r>
-              <w:rPr>
-                <w:b w:val="0"/>
-                <w:sz w:val="20"/>
-              </w:rPr>
-              <w:t>- 60 kW: 20 / 20 / 20 kW</w:t>
-            </w:r>
-          </w:p>
-          <w:p>
-            <w:r>
-              <w:rPr>
-                <w:b w:val="0"/>
-                <w:sz w:val="20"/>
-              </w:rPr>
-              <w:t>- 90 kW: 30 / 30 / 30 kW</w:t>
-            </w:r>
-          </w:p>
-          <w:p>
-            <w:r>
-              <w:rPr>
-                <w:b w:val="0"/>
-                <w:sz w:val="20"/>
-              </w:rPr>
-              <w:t>- 150 kW: 50 / 50 / 50 kW</w:t>
-            </w:r>
-          </w:p>
-          <w:p>
-            <w:r>
-              <w:rPr>
-                <w:b w:val="0"/>
-                <w:sz w:val="20"/>
-              </w:rPr>
-              <w:t>- 240 kW: 80 / 80 / 80 kW</w:t>
-            </w:r>
-          </w:p>
-          <w:p>
-            <w:r>
-              <w:rPr>
-                <w:b w:val="0"/>
-                <w:sz w:val="20"/>
-              </w:rPr>
-              <w:t>- 300 kW: 100 / 100 / 100 kW (all units at rated power, no overload alarms, stable).</w:t>
+              <w:t>30 → 60 → 90 → 150 → 240 → 300 kW.</w:t>
             </w:r>
           </w:p>
         </w:tc>
         <w:tc>
           <w:tcPr>
-            <w:tcW w:type="dxa" w:w="1296"/>
+            <w:tcW w:type="dxa" w:w="3744"/>
+          </w:tcPr>
+          <w:p>
+            <w:r/>
+            <w:r>
+              <w:rPr>
+                <w:b w:val="0"/>
+                <w:sz w:val="20"/>
+              </w:rPr>
+              <w:t>Power is shared equally across the three units at each step, actual power within ±2%, output stable:</w:t>
+            </w:r>
+          </w:p>
+          <w:p>
+            <w:r>
+              <w:rPr>
+                <w:b w:val="0"/>
+                <w:sz w:val="20"/>
+              </w:rPr>
+              <w:t>- 30 kW: 10 / 10 / 10 kW</w:t>
+            </w:r>
+          </w:p>
+          <w:p>
+            <w:r>
+              <w:rPr>
+                <w:b w:val="0"/>
+                <w:sz w:val="20"/>
+              </w:rPr>
+              <w:t>- 60 kW: 20 / 20 / 20 kW</w:t>
+            </w:r>
+          </w:p>
+          <w:p>
+            <w:r>
+              <w:rPr>
+                <w:b w:val="0"/>
+                <w:sz w:val="20"/>
+              </w:rPr>
+              <w:t>- 90 kW: 30 / 30 / 30 kW</w:t>
+            </w:r>
+          </w:p>
+          <w:p>
+            <w:r>
+              <w:rPr>
+                <w:b w:val="0"/>
+                <w:sz w:val="20"/>
+              </w:rPr>
+              <w:t>- 150 kW: 50 / 50 / 50 kW</w:t>
+            </w:r>
+          </w:p>
+          <w:p>
+            <w:r>
+              <w:rPr>
+                <w:b w:val="0"/>
+                <w:sz w:val="20"/>
+              </w:rPr>
+              <w:t>- 240 kW: 80 / 80 / 80 kW</w:t>
+            </w:r>
+          </w:p>
+          <w:p>
+            <w:r>
+              <w:rPr>
+                <w:b w:val="0"/>
+                <w:sz w:val="20"/>
+              </w:rPr>
+              <w:t>- 300 kW: 100 / 100 / 100 kW (all units at rated power, no overload alarms, stable).</w:t>
+            </w:r>
+          </w:p>
+        </w:tc>
+        <w:tc>
+          <w:tcPr>
+            <w:tcW w:type="dxa" w:w="1152"/>
           </w:tcPr>
           <w:p>
             <w:pPr>
@@ -1263,7 +1437,7 @@
         </w:tc>
         <w:tc>
           <w:tcPr>
-            <w:tcW w:type="dxa" w:w="1728"/>
+            <w:tcW w:type="dxa" w:w="1440"/>
           </w:tcPr>
           <w:p>
             <w:r/>
@@ -1279,7 +1453,7 @@
       <w:tr>
         <w:tc>
           <w:tcPr>
-            <w:tcW w:type="dxa" w:w="2736"/>
+            <w:tcW w:type="dxa" w:w="2016"/>
           </w:tcPr>
           <w:p>
             <w:r/>
@@ -1289,21 +1463,12 @@
                 <w:sz w:val="20"/>
               </w:rPr>
               <w:t>2.4 Maximum Discharge Limit</w:t>
-            </w:r>
-          </w:p>
-          <w:p>
-            <w:r>
-              <w:rPr>
-                <w:b/>
-                <w:sz w:val="20"/>
-              </w:rPr>
-              <w:t>Set manual power = 350 kW.</w:t>
             </w:r>
           </w:p>
         </w:tc>
         <w:tc>
           <w:tcPr>
-            <w:tcW w:type="dxa" w:w="4896"/>
+            <w:tcW w:type="dxa" w:w="3312"/>
           </w:tcPr>
           <w:p>
             <w:r/>
@@ -1312,13 +1477,28 @@
                 <w:b w:val="0"/>
                 <w:sz w:val="20"/>
               </w:rPr>
-              <w:t>PLC limits total command to 300 kW; no unit exceeds 100 kW; warning/event logged (if configured).</w:t>
+              <w:t>Set manual power = 350 kW.</w:t>
             </w:r>
           </w:p>
         </w:tc>
         <w:tc>
           <w:tcPr>
-            <w:tcW w:type="dxa" w:w="1296"/>
+            <w:tcW w:type="dxa" w:w="3744"/>
+          </w:tcPr>
+          <w:p>
+            <w:r/>
+            <w:r>
+              <w:rPr>
+                <w:b w:val="0"/>
+                <w:sz w:val="20"/>
+              </w:rPr>
+              <w:t>PLC limits total command to 300 kW; no unit exceeds 100 kW; warning/event logged (if configured).</w:t>
+            </w:r>
+          </w:p>
+        </w:tc>
+        <w:tc>
+          <w:tcPr>
+            <w:tcW w:type="dxa" w:w="1152"/>
           </w:tcPr>
           <w:p>
             <w:pPr>
@@ -1335,7 +1515,7 @@
         </w:tc>
         <w:tc>
           <w:tcPr>
-            <w:tcW w:type="dxa" w:w="1728"/>
+            <w:tcW w:type="dxa" w:w="1440"/>
           </w:tcPr>
           <w:p>
             <w:r/>
@@ -1351,7 +1531,7 @@
       <w:tr>
         <w:tc>
           <w:tcPr>
-            <w:tcW w:type="dxa" w:w="2736"/>
+            <w:tcW w:type="dxa" w:w="2016"/>
           </w:tcPr>
           <w:p>
             <w:r/>
@@ -1361,30 +1541,12 @@
                 <w:sz w:val="20"/>
               </w:rPr>
               <w:t>2.5 Incremental Charge Sweep (grouped)</w:t>
-            </w:r>
-          </w:p>
-          <w:p>
-            <w:r>
-              <w:rPr>
-                <w:b/>
-                <w:sz w:val="20"/>
-              </w:rPr>
-              <w:t>Without returning to zero, step the manual charge command through:</w:t>
-            </w:r>
-          </w:p>
-          <w:p>
-            <w:r>
-              <w:rPr>
-                <w:b/>
-                <w:sz w:val="20"/>
-              </w:rPr>
-              <w:t>-30 → -150 → -300 kW.</w:t>
             </w:r>
           </w:p>
         </w:tc>
         <w:tc>
           <w:tcPr>
-            <w:tcW w:type="dxa" w:w="4896"/>
+            <w:tcW w:type="dxa" w:w="3312"/>
           </w:tcPr>
           <w:p>
             <w:r/>
@@ -1393,7 +1555,7 @@
                 <w:b w:val="0"/>
                 <w:sz w:val="20"/>
               </w:rPr>
-              <w:t>Charging is shared equally, SOC increases, charging stable with no protection trips:</w:t>
+              <w:t>Without returning to zero, step the manual charge command through:</w:t>
             </w:r>
           </w:p>
           <w:p>
@@ -1402,31 +1564,55 @@
                 <w:b w:val="0"/>
                 <w:sz w:val="20"/>
               </w:rPr>
-              <w:t>- -30 kW: -10 / -10 / -10 kW (charging begins)</w:t>
-            </w:r>
-          </w:p>
-          <w:p>
-            <w:r>
-              <w:rPr>
-                <w:b w:val="0"/>
-                <w:sz w:val="20"/>
-              </w:rPr>
-              <w:t>- -150 kW: -50 / -50 / -50 kW</w:t>
-            </w:r>
-          </w:p>
-          <w:p>
-            <w:r>
-              <w:rPr>
-                <w:b w:val="0"/>
-                <w:sz w:val="20"/>
-              </w:rPr>
-              <w:t>- -300 kW: -100 / -100 / -100 kW (full charge, stable).</w:t>
+              <w:t>-30 → -150 → -300 kW.</w:t>
             </w:r>
           </w:p>
         </w:tc>
         <w:tc>
           <w:tcPr>
-            <w:tcW w:type="dxa" w:w="1296"/>
+            <w:tcW w:type="dxa" w:w="3744"/>
+          </w:tcPr>
+          <w:p>
+            <w:r/>
+            <w:r>
+              <w:rPr>
+                <w:b w:val="0"/>
+                <w:sz w:val="20"/>
+              </w:rPr>
+              <w:t>Charging is shared equally, SOC increases, charging stable with no protection trips:</w:t>
+            </w:r>
+          </w:p>
+          <w:p>
+            <w:r>
+              <w:rPr>
+                <w:b w:val="0"/>
+                <w:sz w:val="20"/>
+              </w:rPr>
+              <w:t>- -30 kW: -10 / -10 / -10 kW (charging begins)</w:t>
+            </w:r>
+          </w:p>
+          <w:p>
+            <w:r>
+              <w:rPr>
+                <w:b w:val="0"/>
+                <w:sz w:val="20"/>
+              </w:rPr>
+              <w:t>- -150 kW: -50 / -50 / -50 kW</w:t>
+            </w:r>
+          </w:p>
+          <w:p>
+            <w:r>
+              <w:rPr>
+                <w:b w:val="0"/>
+                <w:sz w:val="20"/>
+              </w:rPr>
+              <w:t>- -300 kW: -100 / -100 / -100 kW (full charge, stable).</w:t>
+            </w:r>
+          </w:p>
+        </w:tc>
+        <w:tc>
+          <w:tcPr>
+            <w:tcW w:type="dxa" w:w="1152"/>
           </w:tcPr>
           <w:p>
             <w:pPr>
@@ -1443,7 +1629,7 @@
         </w:tc>
         <w:tc>
           <w:tcPr>
-            <w:tcW w:type="dxa" w:w="1728"/>
+            <w:tcW w:type="dxa" w:w="1440"/>
           </w:tcPr>
           <w:p>
             <w:r/>
@@ -1459,7 +1645,7 @@
       <w:tr>
         <w:tc>
           <w:tcPr>
-            <w:tcW w:type="dxa" w:w="2736"/>
+            <w:tcW w:type="dxa" w:w="2016"/>
           </w:tcPr>
           <w:p>
             <w:r/>
@@ -1469,21 +1655,12 @@
                 <w:sz w:val="20"/>
               </w:rPr>
               <w:t>2.6 Maximum Charge Limit</w:t>
-            </w:r>
-          </w:p>
-          <w:p>
-            <w:r>
-              <w:rPr>
-                <w:b/>
-                <w:sz w:val="20"/>
-              </w:rPr>
-              <w:t>Set manual power = -400 kW.</w:t>
             </w:r>
           </w:p>
         </w:tc>
         <w:tc>
           <w:tcPr>
-            <w:tcW w:type="dxa" w:w="4896"/>
+            <w:tcW w:type="dxa" w:w="3312"/>
           </w:tcPr>
           <w:p>
             <w:r/>
@@ -1492,13 +1669,28 @@
                 <w:b w:val="0"/>
                 <w:sz w:val="20"/>
               </w:rPr>
-              <w:t>PLC limits charge to -300 kW; no PCS exceeds rated power.</w:t>
+              <w:t>Set manual power = -400 kW.</w:t>
             </w:r>
           </w:p>
         </w:tc>
         <w:tc>
           <w:tcPr>
-            <w:tcW w:type="dxa" w:w="1296"/>
+            <w:tcW w:type="dxa" w:w="3744"/>
+          </w:tcPr>
+          <w:p>
+            <w:r/>
+            <w:r>
+              <w:rPr>
+                <w:b w:val="0"/>
+                <w:sz w:val="20"/>
+              </w:rPr>
+              <w:t>PLC limits charge to -300 kW; no PCS exceeds rated power.</w:t>
+            </w:r>
+          </w:p>
+        </w:tc>
+        <w:tc>
+          <w:tcPr>
+            <w:tcW w:type="dxa" w:w="1152"/>
           </w:tcPr>
           <w:p>
             <w:pPr>
@@ -1515,7 +1707,7 @@
         </w:tc>
         <w:tc>
           <w:tcPr>
-            <w:tcW w:type="dxa" w:w="1728"/>
+            <w:tcW w:type="dxa" w:w="1440"/>
           </w:tcPr>
           <w:p>
             <w:r/>
@@ -1531,7 +1723,7 @@
       <w:tr>
         <w:tc>
           <w:tcPr>
-            <w:tcW w:type="dxa" w:w="2736"/>
+            <w:tcW w:type="dxa" w:w="2016"/>
           </w:tcPr>
           <w:p>
             <w:r/>
@@ -1541,21 +1733,12 @@
                 <w:sz w:val="20"/>
               </w:rPr>
               <w:t>2.7 One Unit Unavailable</w:t>
-            </w:r>
-          </w:p>
-          <w:p>
-            <w:r>
-              <w:rPr>
-                <w:b/>
-                <w:sz w:val="20"/>
-              </w:rPr>
-              <w:t>Disable BESS-3, command 150 kW discharge.</w:t>
             </w:r>
           </w:p>
         </w:tc>
         <w:tc>
           <w:tcPr>
-            <w:tcW w:type="dxa" w:w="4896"/>
+            <w:tcW w:type="dxa" w:w="3312"/>
           </w:tcPr>
           <w:p>
             <w:r/>
@@ -1564,13 +1747,28 @@
                 <w:b w:val="0"/>
                 <w:sz w:val="20"/>
               </w:rPr>
-              <w:t>BESS-1 = 75 kW, BESS-2 = 75 kW, BESS-3 = 0 kW.</w:t>
+              <w:t>Disable BESS-3, command 150 kW discharge.</w:t>
             </w:r>
           </w:p>
         </w:tc>
         <w:tc>
           <w:tcPr>
-            <w:tcW w:type="dxa" w:w="1296"/>
+            <w:tcW w:type="dxa" w:w="3744"/>
+          </w:tcPr>
+          <w:p>
+            <w:r/>
+            <w:r>
+              <w:rPr>
+                <w:b w:val="0"/>
+                <w:sz w:val="20"/>
+              </w:rPr>
+              <w:t>BESS-1 = 75 kW, BESS-2 = 75 kW, BESS-3 = 0 kW.</w:t>
+            </w:r>
+          </w:p>
+        </w:tc>
+        <w:tc>
+          <w:tcPr>
+            <w:tcW w:type="dxa" w:w="1152"/>
           </w:tcPr>
           <w:p>
             <w:pPr>
@@ -1587,7 +1785,7 @@
         </w:tc>
         <w:tc>
           <w:tcPr>
-            <w:tcW w:type="dxa" w:w="1728"/>
+            <w:tcW w:type="dxa" w:w="1440"/>
           </w:tcPr>
           <w:p>
             <w:r/>
@@ -1603,7 +1801,7 @@
       <w:tr>
         <w:tc>
           <w:tcPr>
-            <w:tcW w:type="dxa" w:w="2736"/>
+            <w:tcW w:type="dxa" w:w="2016"/>
           </w:tcPr>
           <w:p>
             <w:r/>
@@ -1613,21 +1811,12 @@
                 <w:sz w:val="20"/>
               </w:rPr>
               <w:t>2.8 Two Units Unavailable</w:t>
-            </w:r>
-          </w:p>
-          <w:p>
-            <w:r>
-              <w:rPr>
-                <w:b/>
-                <w:sz w:val="20"/>
-              </w:rPr>
-              <w:t>Disable BESS-2 and BESS-3, command 150 kW discharge.</w:t>
             </w:r>
           </w:p>
         </w:tc>
         <w:tc>
           <w:tcPr>
-            <w:tcW w:type="dxa" w:w="4896"/>
+            <w:tcW w:type="dxa" w:w="3312"/>
           </w:tcPr>
           <w:p>
             <w:r/>
@@ -1636,13 +1825,28 @@
                 <w:b w:val="0"/>
                 <w:sz w:val="20"/>
               </w:rPr>
-              <w:t>BESS-1 = 100 kW (limited), BESS-2/3 = 0 kW. Remaining 50 kW supplied by grid or left unmet; available capacity updated.</w:t>
+              <w:t>Disable BESS-2 and BESS-3, command 150 kW discharge.</w:t>
             </w:r>
           </w:p>
         </w:tc>
         <w:tc>
           <w:tcPr>
-            <w:tcW w:type="dxa" w:w="1296"/>
+            <w:tcW w:type="dxa" w:w="3744"/>
+          </w:tcPr>
+          <w:p>
+            <w:r/>
+            <w:r>
+              <w:rPr>
+                <w:b w:val="0"/>
+                <w:sz w:val="20"/>
+              </w:rPr>
+              <w:t>BESS-1 = 100 kW (limited), BESS-2/3 = 0 kW. Remaining 50 kW supplied by grid or left unmet; available capacity updated.</w:t>
+            </w:r>
+          </w:p>
+        </w:tc>
+        <w:tc>
+          <w:tcPr>
+            <w:tcW w:type="dxa" w:w="1152"/>
           </w:tcPr>
           <w:p>
             <w:pPr>
@@ -1659,7 +1863,7 @@
         </w:tc>
         <w:tc>
           <w:tcPr>
-            <w:tcW w:type="dxa" w:w="1728"/>
+            <w:tcW w:type="dxa" w:w="1440"/>
           </w:tcPr>
           <w:p>
             <w:r/>
@@ -1675,7 +1879,7 @@
       <w:tr>
         <w:tc>
           <w:tcPr>
-            <w:tcW w:type="dxa" w:w="2736"/>
+            <w:tcW w:type="dxa" w:w="2016"/>
           </w:tcPr>
           <w:p>
             <w:r/>
@@ -1685,21 +1889,12 @@
                 <w:sz w:val="20"/>
               </w:rPr>
               <w:t>2.9 Ramp Rate Verification</w:t>
-            </w:r>
-          </w:p>
-          <w:p>
-            <w:r>
-              <w:rPr>
-                <w:b/>
-                <w:sz w:val="20"/>
-              </w:rPr>
-              <w:t>Increase power 0 → 300 kW using the configured ramp rate.</w:t>
             </w:r>
           </w:p>
         </w:tc>
         <w:tc>
           <w:tcPr>
-            <w:tcW w:type="dxa" w:w="4896"/>
+            <w:tcW w:type="dxa" w:w="3312"/>
           </w:tcPr>
           <w:p>
             <w:r/>
@@ -1708,13 +1903,28 @@
                 <w:b w:val="0"/>
                 <w:sz w:val="20"/>
               </w:rPr>
-              <w:t>Output follows the configured ramp; no oscillation; no unit trips.</w:t>
+              <w:t>Increase power 0 → 300 kW using the configured ramp rate.</w:t>
             </w:r>
           </w:p>
         </w:tc>
         <w:tc>
           <w:tcPr>
-            <w:tcW w:type="dxa" w:w="1296"/>
+            <w:tcW w:type="dxa" w:w="3744"/>
+          </w:tcPr>
+          <w:p>
+            <w:r/>
+            <w:r>
+              <w:rPr>
+                <w:b w:val="0"/>
+                <w:sz w:val="20"/>
+              </w:rPr>
+              <w:t>Output follows the configured ramp; no oscillation; no unit trips.</w:t>
+            </w:r>
+          </w:p>
+        </w:tc>
+        <w:tc>
+          <w:tcPr>
+            <w:tcW w:type="dxa" w:w="1152"/>
           </w:tcPr>
           <w:p>
             <w:pPr>
@@ -1731,7 +1941,7 @@
         </w:tc>
         <w:tc>
           <w:tcPr>
-            <w:tcW w:type="dxa" w:w="1728"/>
+            <w:tcW w:type="dxa" w:w="1440"/>
           </w:tcPr>
           <w:p>
             <w:r/>
@@ -1747,7 +1957,7 @@
       <w:tr>
         <w:tc>
           <w:tcPr>
-            <w:tcW w:type="dxa" w:w="2736"/>
+            <w:tcW w:type="dxa" w:w="2016"/>
           </w:tcPr>
           <w:p>
             <w:r/>
@@ -1757,21 +1967,12 @@
                 <w:sz w:val="20"/>
               </w:rPr>
               <w:t>2.10 Sudden Stop Command</w:t>
-            </w:r>
-          </w:p>
-          <w:p>
-            <w:r>
-              <w:rPr>
-                <w:b/>
-                <w:sz w:val="20"/>
-              </w:rPr>
-              <w:t>While discharging at 300 kW, command 0 kW.</w:t>
             </w:r>
           </w:p>
         </w:tc>
         <w:tc>
           <w:tcPr>
-            <w:tcW w:type="dxa" w:w="4896"/>
+            <w:tcW w:type="dxa" w:w="3312"/>
           </w:tcPr>
           <w:p>
             <w:r/>
@@ -1780,13 +1981,28 @@
                 <w:b w:val="0"/>
                 <w:sz w:val="20"/>
               </w:rPr>
-              <w:t>Output decreases per ramp settings; stable transition to zero power; no alarms.</w:t>
+              <w:t>While discharging at 300 kW, command 0 kW.</w:t>
             </w:r>
           </w:p>
         </w:tc>
         <w:tc>
           <w:tcPr>
-            <w:tcW w:type="dxa" w:w="1296"/>
+            <w:tcW w:type="dxa" w:w="3744"/>
+          </w:tcPr>
+          <w:p>
+            <w:r/>
+            <w:r>
+              <w:rPr>
+                <w:b w:val="0"/>
+                <w:sz w:val="20"/>
+              </w:rPr>
+              <w:t>Output decreases per ramp settings; stable transition to zero power; no alarms.</w:t>
+            </w:r>
+          </w:p>
+        </w:tc>
+        <w:tc>
+          <w:tcPr>
+            <w:tcW w:type="dxa" w:w="1152"/>
           </w:tcPr>
           <w:p>
             <w:pPr>
@@ -1803,7 +2019,7 @@
         </w:tc>
         <w:tc>
           <w:tcPr>
-            <w:tcW w:type="dxa" w:w="1728"/>
+            <w:tcW w:type="dxa" w:w="1440"/>
           </w:tcPr>
           <w:p>
             <w:r/>
@@ -1819,7 +2035,7 @@
       <w:tr>
         <w:tc>
           <w:tcPr>
-            <w:tcW w:type="dxa" w:w="2736"/>
+            <w:tcW w:type="dxa" w:w="2016"/>
           </w:tcPr>
           <w:p>
             <w:r/>
@@ -1829,21 +2045,12 @@
                 <w:sz w:val="20"/>
               </w:rPr>
               <w:t>2.11 Mode Change to Automatic (Peak Shaving)</w:t>
-            </w:r>
-          </w:p>
-          <w:p>
-            <w:r>
-              <w:rPr>
-                <w:b/>
-                <w:sz w:val="20"/>
-              </w:rPr>
-              <w:t>Operate at 150 kW Manual, then switch to Peak Shaving Mode.</w:t>
             </w:r>
           </w:p>
         </w:tc>
         <w:tc>
           <w:tcPr>
-            <w:tcW w:type="dxa" w:w="4896"/>
+            <w:tcW w:type="dxa" w:w="3312"/>
           </w:tcPr>
           <w:p>
             <w:r/>
@@ -1852,13 +2059,28 @@
                 <w:b w:val="0"/>
                 <w:sz w:val="20"/>
               </w:rPr>
-              <w:t>Manual command released; automatic controller assumes control without interruption; no power spikes or trips.</w:t>
+              <w:t>Operate at 150 kW Manual, then switch to Peak Shaving Mode.</w:t>
             </w:r>
           </w:p>
         </w:tc>
         <w:tc>
           <w:tcPr>
-            <w:tcW w:type="dxa" w:w="1296"/>
+            <w:tcW w:type="dxa" w:w="3744"/>
+          </w:tcPr>
+          <w:p>
+            <w:r/>
+            <w:r>
+              <w:rPr>
+                <w:b w:val="0"/>
+                <w:sz w:val="20"/>
+              </w:rPr>
+              <w:t>Manual command released; automatic controller assumes control without interruption; no power spikes or trips.</w:t>
+            </w:r>
+          </w:p>
+        </w:tc>
+        <w:tc>
+          <w:tcPr>
+            <w:tcW w:type="dxa" w:w="1152"/>
           </w:tcPr>
           <w:p>
             <w:pPr>
@@ -1875,7 +2097,7 @@
         </w:tc>
         <w:tc>
           <w:tcPr>
-            <w:tcW w:type="dxa" w:w="1728"/>
+            <w:tcW w:type="dxa" w:w="1440"/>
           </w:tcPr>
           <w:p>
             <w:r/>
@@ -1924,15 +2146,16 @@
         <w:tblLook w:firstColumn="1" w:firstRow="1" w:lastColumn="0" w:lastRow="0" w:noHBand="0" w:noVBand="1" w:val="04A0"/>
       </w:tblPr>
       <w:tblGrid>
-        <w:gridCol w:w="2160"/>
-        <w:gridCol w:w="2160"/>
-        <w:gridCol w:w="2160"/>
-        <w:gridCol w:w="2160"/>
+        <w:gridCol w:w="1728"/>
+        <w:gridCol w:w="1728"/>
+        <w:gridCol w:w="1728"/>
+        <w:gridCol w:w="1728"/>
+        <w:gridCol w:w="1728"/>
       </w:tblGrid>
       <w:tr>
         <w:tc>
           <w:tcPr>
-            <w:tcW w:type="dxa" w:w="2736"/>
+            <w:tcW w:type="dxa" w:w="2016"/>
             <w:shd w:val="clear" w:color="auto" w:fill="1F4E79"/>
           </w:tcPr>
           <w:p>
@@ -1952,7 +2175,7 @@
         </w:tc>
         <w:tc>
           <w:tcPr>
-            <w:tcW w:type="dxa" w:w="4896"/>
+            <w:tcW w:type="dxa" w:w="3312"/>
             <w:shd w:val="clear" w:color="auto" w:fill="1F4E79"/>
           </w:tcPr>
           <w:p>
@@ -1966,13 +2189,13 @@
                 <w:color w:val="FFFFFF"/>
                 <w:sz w:val="20"/>
               </w:rPr>
-              <w:t>Expected Results</w:t>
+              <w:t>Procedure</w:t>
             </w:r>
           </w:p>
         </w:tc>
         <w:tc>
           <w:tcPr>
-            <w:tcW w:type="dxa" w:w="1296"/>
+            <w:tcW w:type="dxa" w:w="3744"/>
             <w:shd w:val="clear" w:color="auto" w:fill="1F4E79"/>
           </w:tcPr>
           <w:p>
@@ -1986,13 +2209,33 @@
                 <w:color w:val="FFFFFF"/>
                 <w:sz w:val="20"/>
               </w:rPr>
-              <w:t>Approved</w:t>
-            </w:r>
-          </w:p>
+              <w:t>Expected Results</w:t>
+            </w:r>
+          </w:p>
+        </w:tc>
+        <w:tc>
+          <w:tcPr>
+            <w:tcW w:type="dxa" w:w="1152"/>
+            <w:shd w:val="clear" w:color="auto" w:fill="1F4E79"/>
+          </w:tcPr>
           <w:p>
             <w:pPr>
               <w:jc w:val="center"/>
             </w:pPr>
+            <w:r/>
+            <w:r>
+              <w:rPr>
+                <w:b/>
+                <w:color w:val="FFFFFF"/>
+                <w:sz w:val="20"/>
+              </w:rPr>
+              <w:t>Approved</w:t>
+            </w:r>
+          </w:p>
+          <w:p>
+            <w:pPr>
+              <w:jc w:val="center"/>
+            </w:pPr>
             <w:r>
               <w:rPr>
                 <w:b/>
@@ -2005,7 +2248,7 @@
         </w:tc>
         <w:tc>
           <w:tcPr>
-            <w:tcW w:type="dxa" w:w="1728"/>
+            <w:tcW w:type="dxa" w:w="1440"/>
             <w:shd w:val="clear" w:color="auto" w:fill="1F4E79"/>
           </w:tcPr>
           <w:p>
@@ -2027,7 +2270,7 @@
       <w:tr>
         <w:tc>
           <w:tcPr>
-            <w:tcW w:type="dxa" w:w="2736"/>
+            <w:tcW w:type="dxa" w:w="2016"/>
           </w:tcPr>
           <w:p>
             <w:r/>
@@ -2037,30 +2280,12 @@
                 <w:sz w:val="20"/>
               </w:rPr>
               <w:t>3.1 Incremental Load Sweep vs. Peak Limit (grouped)</w:t>
-            </w:r>
-          </w:p>
-          <w:p>
-            <w:r>
-              <w:rPr>
-                <w:b/>
-                <w:sz w:val="20"/>
-              </w:rPr>
-              <w:t>With Peak Shaving active and limit = 150 kW, step the site load through:</w:t>
-            </w:r>
-          </w:p>
-          <w:p>
-            <w:r>
-              <w:rPr>
-                <w:b/>
-                <w:sz w:val="20"/>
-              </w:rPr>
-              <w:t>100 → 140 → 150 → 170 → 240 → 330 → 450 → 520 kW.</w:t>
             </w:r>
           </w:p>
         </w:tc>
         <w:tc>
           <w:tcPr>
-            <w:tcW w:type="dxa" w:w="4896"/>
+            <w:tcW w:type="dxa" w:w="3312"/>
           </w:tcPr>
           <w:p>
             <w:r/>
@@ -2069,7 +2294,7 @@
                 <w:b w:val="0"/>
                 <w:sz w:val="20"/>
               </w:rPr>
-              <w:t>Grid import held at/below 150 kW while capacity allows; battery supplies the excess, shared equally, no unnecessary cycling:</w:t>
+              <w:t>With Peak Shaving active and limit = 150 kW, step the site load through:</w:t>
             </w:r>
           </w:p>
           <w:p>
@@ -2078,76 +2303,100 @@
                 <w:b w:val="0"/>
                 <w:sz w:val="20"/>
               </w:rPr>
-              <w:t>- 100 kW: grid 100, BESS 0</w:t>
-            </w:r>
-          </w:p>
-          <w:p>
-            <w:r>
-              <w:rPr>
-                <w:b w:val="0"/>
-                <w:sz w:val="20"/>
-              </w:rPr>
-              <w:t>- 140 kW: grid 140, BESS 0</w:t>
-            </w:r>
-          </w:p>
-          <w:p>
-            <w:r>
-              <w:rPr>
-                <w:b w:val="0"/>
-                <w:sz w:val="20"/>
-              </w:rPr>
-              <w:t>- 150 kW: grid 150, BESS 0 (no cycling)</w:t>
-            </w:r>
-          </w:p>
-          <w:p>
-            <w:r>
-              <w:rPr>
-                <w:b w:val="0"/>
-                <w:sz w:val="20"/>
-              </w:rPr>
-              <w:t>- 170 kW: grid 150, BESS 20 (≈6.7 each)</w:t>
-            </w:r>
-          </w:p>
-          <w:p>
-            <w:r>
-              <w:rPr>
-                <w:b w:val="0"/>
-                <w:sz w:val="20"/>
-              </w:rPr>
-              <w:t>- 240 kW: grid 150, BESS 90 (30 each)</w:t>
-            </w:r>
-          </w:p>
-          <w:p>
-            <w:r>
-              <w:rPr>
-                <w:b w:val="0"/>
-                <w:sz w:val="20"/>
-              </w:rPr>
-              <w:t>- 330 kW: grid 150, BESS 180 (60 each)</w:t>
-            </w:r>
-          </w:p>
-          <w:p>
-            <w:r>
-              <w:rPr>
-                <w:b w:val="0"/>
-                <w:sz w:val="20"/>
-              </w:rPr>
-              <w:t>- 450 kW: grid 150, BESS 300 (100 each, no overload)</w:t>
-            </w:r>
-          </w:p>
-          <w:p>
-            <w:r>
-              <w:rPr>
-                <w:b w:val="0"/>
-                <w:sz w:val="20"/>
-              </w:rPr>
-              <w:t>- 520 kW: BESS max 300, grid 220 (peak cannot be held), no PCS overload.</w:t>
+              <w:t>100 → 140 → 150 → 170 → 240 → 330 → 450 → 520 kW.</w:t>
             </w:r>
           </w:p>
         </w:tc>
         <w:tc>
           <w:tcPr>
-            <w:tcW w:type="dxa" w:w="1296"/>
+            <w:tcW w:type="dxa" w:w="3744"/>
+          </w:tcPr>
+          <w:p>
+            <w:r/>
+            <w:r>
+              <w:rPr>
+                <w:b w:val="0"/>
+                <w:sz w:val="20"/>
+              </w:rPr>
+              <w:t>Grid import held at/below 150 kW while capacity allows; battery supplies the excess, shared equally, no unnecessary cycling:</w:t>
+            </w:r>
+          </w:p>
+          <w:p>
+            <w:r>
+              <w:rPr>
+                <w:b w:val="0"/>
+                <w:sz w:val="20"/>
+              </w:rPr>
+              <w:t>- 100 kW: grid 100, BESS 0</w:t>
+            </w:r>
+          </w:p>
+          <w:p>
+            <w:r>
+              <w:rPr>
+                <w:b w:val="0"/>
+                <w:sz w:val="20"/>
+              </w:rPr>
+              <w:t>- 140 kW: grid 140, BESS 0</w:t>
+            </w:r>
+          </w:p>
+          <w:p>
+            <w:r>
+              <w:rPr>
+                <w:b w:val="0"/>
+                <w:sz w:val="20"/>
+              </w:rPr>
+              <w:t>- 150 kW: grid 150, BESS 0 (no cycling)</w:t>
+            </w:r>
+          </w:p>
+          <w:p>
+            <w:r>
+              <w:rPr>
+                <w:b w:val="0"/>
+                <w:sz w:val="20"/>
+              </w:rPr>
+              <w:t>- 170 kW: grid 150, BESS 20 (≈6.7 each)</w:t>
+            </w:r>
+          </w:p>
+          <w:p>
+            <w:r>
+              <w:rPr>
+                <w:b w:val="0"/>
+                <w:sz w:val="20"/>
+              </w:rPr>
+              <w:t>- 240 kW: grid 150, BESS 90 (30 each)</w:t>
+            </w:r>
+          </w:p>
+          <w:p>
+            <w:r>
+              <w:rPr>
+                <w:b w:val="0"/>
+                <w:sz w:val="20"/>
+              </w:rPr>
+              <w:t>- 330 kW: grid 150, BESS 180 (60 each)</w:t>
+            </w:r>
+          </w:p>
+          <w:p>
+            <w:r>
+              <w:rPr>
+                <w:b w:val="0"/>
+                <w:sz w:val="20"/>
+              </w:rPr>
+              <w:t>- 450 kW: grid 150, BESS 300 (100 each, no overload)</w:t>
+            </w:r>
+          </w:p>
+          <w:p>
+            <w:r>
+              <w:rPr>
+                <w:b w:val="0"/>
+                <w:sz w:val="20"/>
+              </w:rPr>
+              <w:t>- 520 kW: BESS max 300, grid 220 (peak cannot be held), no PCS overload.</w:t>
+            </w:r>
+          </w:p>
+        </w:tc>
+        <w:tc>
+          <w:tcPr>
+            <w:tcW w:type="dxa" w:w="1152"/>
           </w:tcPr>
           <w:p>
             <w:pPr>
@@ -2164,7 +2413,7 @@
         </w:tc>
         <w:tc>
           <w:tcPr>
-            <w:tcW w:type="dxa" w:w="1728"/>
+            <w:tcW w:type="dxa" w:w="1440"/>
           </w:tcPr>
           <w:p>
             <w:r/>
@@ -2180,7 +2429,7 @@
       <w:tr>
         <w:tc>
           <w:tcPr>
-            <w:tcW w:type="dxa" w:w="2736"/>
+            <w:tcW w:type="dxa" w:w="2016"/>
           </w:tcPr>
           <w:p>
             <w:r/>
@@ -2190,21 +2439,12 @@
                 <w:sz w:val="20"/>
               </w:rPr>
               <w:t>3.2 Curtailment – Grid Limit 100 kW</w:t>
-            </w:r>
-          </w:p>
-          <w:p>
-            <w:r>
-              <w:rPr>
-                <w:b/>
-                <w:sz w:val="20"/>
-              </w:rPr>
-              <w:t>Load = 480 kW; enable Curtailment; Max Consumed = 100 kW; current limit from grid = 100 kW.</w:t>
             </w:r>
           </w:p>
         </w:tc>
         <w:tc>
           <w:tcPr>
-            <w:tcW w:type="dxa" w:w="4896"/>
+            <w:tcW w:type="dxa" w:w="3312"/>
           </w:tcPr>
           <w:p>
             <w:r/>
@@ -2213,13 +2453,28 @@
                 <w:b w:val="0"/>
                 <w:sz w:val="20"/>
               </w:rPr>
-              <w:t>Battery = 300 kW (max); Grid import = 100 kW; Curtailment = 80 kW. Peak limit cannot be maintained; no PCS overload.</w:t>
+              <w:t>Load = 480 kW; enable Curtailment; Max Consumed = 100 kW; current limit from grid = 100 kW.</w:t>
             </w:r>
           </w:p>
         </w:tc>
         <w:tc>
           <w:tcPr>
-            <w:tcW w:type="dxa" w:w="1296"/>
+            <w:tcW w:type="dxa" w:w="3744"/>
+          </w:tcPr>
+          <w:p>
+            <w:r/>
+            <w:r>
+              <w:rPr>
+                <w:b w:val="0"/>
+                <w:sz w:val="20"/>
+              </w:rPr>
+              <w:t>Battery = 300 kW (max); Grid import = 100 kW; Curtailment = 80 kW. Peak limit cannot be maintained; no PCS overload.</w:t>
+            </w:r>
+          </w:p>
+        </w:tc>
+        <w:tc>
+          <w:tcPr>
+            <w:tcW w:type="dxa" w:w="1152"/>
           </w:tcPr>
           <w:p>
             <w:pPr>
@@ -2236,7 +2491,7 @@
         </w:tc>
         <w:tc>
           <w:tcPr>
-            <w:tcW w:type="dxa" w:w="1728"/>
+            <w:tcW w:type="dxa" w:w="1440"/>
           </w:tcPr>
           <w:p>
             <w:r/>
@@ -2252,7 +2507,7 @@
       <w:tr>
         <w:tc>
           <w:tcPr>
-            <w:tcW w:type="dxa" w:w="2736"/>
+            <w:tcW w:type="dxa" w:w="2016"/>
           </w:tcPr>
           <w:p>
             <w:r/>
@@ -2262,21 +2517,12 @@
                 <w:sz w:val="20"/>
               </w:rPr>
               <w:t>3.3 Curtailment – Grid Limit 50 kW</w:t>
-            </w:r>
-          </w:p>
-          <w:p>
-            <w:r>
-              <w:rPr>
-                <w:b/>
-                <w:sz w:val="20"/>
-              </w:rPr>
-              <w:t>Load = 480 kW; enable Curtailment; Max Consumed = 100 kW; current limit from grid = 50 kW.</w:t>
             </w:r>
           </w:p>
         </w:tc>
         <w:tc>
           <w:tcPr>
-            <w:tcW w:type="dxa" w:w="4896"/>
+            <w:tcW w:type="dxa" w:w="3312"/>
           </w:tcPr>
           <w:p>
             <w:r/>
@@ -2285,13 +2531,28 @@
                 <w:b w:val="0"/>
                 <w:sz w:val="20"/>
               </w:rPr>
-              <w:t>Battery = 300 kW (max); Grid import = 50 kW; Curtailment = 100 kW (max). Curtailment covers up to 100 kW; remaining 30 kW covered from grid (50 + 30 kW). Peak limit cannot be maintained; no PCS overload.</w:t>
+              <w:t>Load = 480 kW; enable Curtailment; Max Consumed = 100 kW; current limit from grid = 50 kW.</w:t>
             </w:r>
           </w:p>
         </w:tc>
         <w:tc>
           <w:tcPr>
-            <w:tcW w:type="dxa" w:w="1296"/>
+            <w:tcW w:type="dxa" w:w="3744"/>
+          </w:tcPr>
+          <w:p>
+            <w:r/>
+            <w:r>
+              <w:rPr>
+                <w:b w:val="0"/>
+                <w:sz w:val="20"/>
+              </w:rPr>
+              <w:t>Battery = 300 kW (max); Grid import = 50 kW; Curtailment = 100 kW (max). Curtailment covers up to 100 kW; remaining 30 kW covered from grid (50 + 30 kW). Peak limit cannot be maintained; no PCS overload.</w:t>
+            </w:r>
+          </w:p>
+        </w:tc>
+        <w:tc>
+          <w:tcPr>
+            <w:tcW w:type="dxa" w:w="1152"/>
           </w:tcPr>
           <w:p>
             <w:pPr>
@@ -2308,7 +2569,7 @@
         </w:tc>
         <w:tc>
           <w:tcPr>
-            <w:tcW w:type="dxa" w:w="1728"/>
+            <w:tcW w:type="dxa" w:w="1440"/>
           </w:tcPr>
           <w:p>
             <w:r/>
@@ -2324,7 +2585,7 @@
       <w:tr>
         <w:tc>
           <w:tcPr>
-            <w:tcW w:type="dxa" w:w="2736"/>
+            <w:tcW w:type="dxa" w:w="2016"/>
           </w:tcPr>
           <w:p>
             <w:r/>
@@ -2334,30 +2595,12 @@
                 <w:sz w:val="20"/>
               </w:rPr>
               <w:t>3.4 Dynamic Load Response (grouped)</w:t>
-            </w:r>
-          </w:p>
-          <w:p>
-            <w:r>
-              <w:rPr>
-                <w:b/>
-                <w:sz w:val="20"/>
-              </w:rPr>
-              <w:t>Execute consecutively:</w:t>
-            </w:r>
-          </w:p>
-          <w:p>
-            <w:r>
-              <w:rPr>
-                <w:b/>
-                <w:sz w:val="20"/>
-              </w:rPr>
-              <w:t>(a) reduce load 450 → 300 kW; (b) rapid increase 120 → 400 kW; (c) rapid decrease 400 → 120 kW; (d) oscillating load 150/250/170/280/140 kW every 10 s.</w:t>
             </w:r>
           </w:p>
         </w:tc>
         <w:tc>
           <w:tcPr>
-            <w:tcW w:type="dxa" w:w="4896"/>
+            <w:tcW w:type="dxa" w:w="3312"/>
           </w:tcPr>
           <w:p>
             <w:r/>
@@ -2366,7 +2609,7 @@
                 <w:b w:val="0"/>
                 <w:sz w:val="20"/>
               </w:rPr>
-              <w:t>(a) Battery output reduces smoothly, no oscillation/delay, grid ≈150 kW.</w:t>
+              <w:t>Execute consecutively:</w:t>
             </w:r>
           </w:p>
           <w:p>
@@ -2375,7 +2618,7 @@
                 <w:b w:val="0"/>
                 <w:sz w:val="20"/>
               </w:rPr>
-              <w:t>(b) Battery responds within configured response time, grid overshoot resolved within 4 s, stable control.</w:t>
+              <w:t>(a) reduce load 450 → 300 kW;</w:t>
             </w:r>
           </w:p>
           <w:p>
@@ -2384,7 +2627,7 @@
                 <w:b w:val="0"/>
                 <w:sz w:val="20"/>
               </w:rPr>
-              <w:t>(c) Battery ramps down, no reverse power, no oscillation.</w:t>
+              <w:t>(b) rapid increase 120 → 400 kW;</w:t>
             </w:r>
           </w:p>
           <w:p>
@@ -2393,13 +2636,64 @@
                 <w:b w:val="0"/>
                 <w:sz w:val="20"/>
               </w:rPr>
-              <w:t>(d) Battery follows demand, no hunting, stable control.</w:t>
+              <w:t>(c) rapid decrease 400 → 120 kW;</w:t>
+            </w:r>
+          </w:p>
+          <w:p>
+            <w:r>
+              <w:rPr>
+                <w:b w:val="0"/>
+                <w:sz w:val="20"/>
+              </w:rPr>
+              <w:t>(d) oscillating load 150/250/170/280/140 kW every 10 s.</w:t>
             </w:r>
           </w:p>
         </w:tc>
         <w:tc>
           <w:tcPr>
-            <w:tcW w:type="dxa" w:w="1296"/>
+            <w:tcW w:type="dxa" w:w="3744"/>
+          </w:tcPr>
+          <w:p>
+            <w:r/>
+            <w:r>
+              <w:rPr>
+                <w:b w:val="0"/>
+                <w:sz w:val="20"/>
+              </w:rPr>
+              <w:t>(a) Battery output reduces smoothly, no oscillation/delay, grid ≈150 kW.</w:t>
+            </w:r>
+          </w:p>
+          <w:p>
+            <w:r>
+              <w:rPr>
+                <w:b w:val="0"/>
+                <w:sz w:val="20"/>
+              </w:rPr>
+              <w:t>(b) Battery responds within configured response time, grid overshoot resolved within 4 s, stable control.</w:t>
+            </w:r>
+          </w:p>
+          <w:p>
+            <w:r>
+              <w:rPr>
+                <w:b w:val="0"/>
+                <w:sz w:val="20"/>
+              </w:rPr>
+              <w:t>(c) Battery ramps down, no reverse power, no oscillation.</w:t>
+            </w:r>
+          </w:p>
+          <w:p>
+            <w:r>
+              <w:rPr>
+                <w:b w:val="0"/>
+                <w:sz w:val="20"/>
+              </w:rPr>
+              <w:t>(d) Battery follows demand, no hunting, stable control.</w:t>
+            </w:r>
+          </w:p>
+        </w:tc>
+        <w:tc>
+          <w:tcPr>
+            <w:tcW w:type="dxa" w:w="1152"/>
           </w:tcPr>
           <w:p>
             <w:pPr>
@@ -2416,7 +2710,7 @@
         </w:tc>
         <w:tc>
           <w:tcPr>
-            <w:tcW w:type="dxa" w:w="1728"/>
+            <w:tcW w:type="dxa" w:w="1440"/>
           </w:tcPr>
           <w:p>
             <w:r/>
@@ -2432,7 +2726,7 @@
       <w:tr>
         <w:tc>
           <w:tcPr>
-            <w:tcW w:type="dxa" w:w="2736"/>
+            <w:tcW w:type="dxa" w:w="2016"/>
           </w:tcPr>
           <w:p>
             <w:r/>
@@ -2442,30 +2736,12 @@
                 <w:sz w:val="20"/>
               </w:rPr>
               <w:t>3.5 Unit Redundancy (grouped)</w:t>
-            </w:r>
-          </w:p>
-          <w:p>
-            <w:r>
-              <w:rPr>
-                <w:b/>
-                <w:sz w:val="20"/>
-              </w:rPr>
-              <w:t>Execute consecutively with load 300 kW, Peak = 150 kW:</w:t>
-            </w:r>
-          </w:p>
-          <w:p>
-            <w:r>
-              <w:rPr>
-                <w:b/>
-                <w:sz w:val="20"/>
-              </w:rPr>
-              <w:t>(a) disable Unit 3; (b) also disable Unit 2 (load 250 kW); (c) reconnect Unit 3.</w:t>
             </w:r>
           </w:p>
         </w:tc>
         <w:tc>
           <w:tcPr>
-            <w:tcW w:type="dxa" w:w="4896"/>
+            <w:tcW w:type="dxa" w:w="3312"/>
           </w:tcPr>
           <w:p>
             <w:r/>
@@ -2474,7 +2750,7 @@
                 <w:b w:val="0"/>
                 <w:sz w:val="20"/>
               </w:rPr>
-              <w:t>(a) Required battery 150 kW → Unit1 75, Unit2 75, Unit3 0.</w:t>
+              <w:t>Execute consecutively with load 300 kW, Peak = 150 kW:</w:t>
             </w:r>
           </w:p>
           <w:p>
@@ -2483,7 +2759,7 @@
                 <w:b w:val="0"/>
                 <w:sz w:val="20"/>
               </w:rPr>
-              <w:t>(b) Unit1 supplies max 100 kW, grid import 150 kW, no overload.</w:t>
+              <w:t>(a) disable Unit 3;</w:t>
             </w:r>
           </w:p>
           <w:p>
@@ -2492,13 +2768,55 @@
                 <w:b w:val="0"/>
                 <w:sz w:val="20"/>
               </w:rPr>
-              <w:t>(c) PLC automatically redistributes power on reconnection, no interruption.</w:t>
+              <w:t>(b) also disable Unit 2 (load 250 kW);</w:t>
+            </w:r>
+          </w:p>
+          <w:p>
+            <w:r>
+              <w:rPr>
+                <w:b w:val="0"/>
+                <w:sz w:val="20"/>
+              </w:rPr>
+              <w:t>(c) reconnect Unit 3.</w:t>
             </w:r>
           </w:p>
         </w:tc>
         <w:tc>
           <w:tcPr>
-            <w:tcW w:type="dxa" w:w="1296"/>
+            <w:tcW w:type="dxa" w:w="3744"/>
+          </w:tcPr>
+          <w:p>
+            <w:r/>
+            <w:r>
+              <w:rPr>
+                <w:b w:val="0"/>
+                <w:sz w:val="20"/>
+              </w:rPr>
+              <w:t>(a) Required battery 150 kW → Unit1 75, Unit2 75, Unit3 0.</w:t>
+            </w:r>
+          </w:p>
+          <w:p>
+            <w:r>
+              <w:rPr>
+                <w:b w:val="0"/>
+                <w:sz w:val="20"/>
+              </w:rPr>
+              <w:t>(b) Unit1 supplies max 100 kW, grid import 150 kW, no overload.</w:t>
+            </w:r>
+          </w:p>
+          <w:p>
+            <w:r>
+              <w:rPr>
+                <w:b w:val="0"/>
+                <w:sz w:val="20"/>
+              </w:rPr>
+              <w:t>(c) PLC automatically redistributes power on reconnection, no interruption.</w:t>
+            </w:r>
+          </w:p>
+        </w:tc>
+        <w:tc>
+          <w:tcPr>
+            <w:tcW w:type="dxa" w:w="1152"/>
           </w:tcPr>
           <w:p>
             <w:pPr>
@@ -2515,7 +2833,7 @@
         </w:tc>
         <w:tc>
           <w:tcPr>
-            <w:tcW w:type="dxa" w:w="1728"/>
+            <w:tcW w:type="dxa" w:w="1440"/>
           </w:tcPr>
           <w:p>
             <w:r/>
@@ -2531,7 +2849,7 @@
       <w:tr>
         <w:tc>
           <w:tcPr>
-            <w:tcW w:type="dxa" w:w="2736"/>
+            <w:tcW w:type="dxa" w:w="2016"/>
           </w:tcPr>
           <w:p>
             <w:r/>
@@ -2541,30 +2859,12 @@
                 <w:sz w:val="20"/>
               </w:rPr>
               <w:t>3.6 SOC-Based Behaviour (grouped)</w:t>
-            </w:r>
-          </w:p>
-          <w:p>
-            <w:r>
-              <w:rPr>
-                <w:b/>
-                <w:sz w:val="20"/>
-              </w:rPr>
-              <w:t>Verify:</w:t>
-            </w:r>
-          </w:p>
-          <w:p>
-            <w:r>
-              <w:rPr>
-                <w:b/>
-                <w:sz w:val="20"/>
-              </w:rPr>
-              <w:t>(a) SOC = 10%, load exceeds peak; (b) SOC = 100%, peak load; (c) SOC recovers above minimum; (d) unequal SOC 95/70/40%, 150 kW; (e) all SOC equal (80%).</w:t>
             </w:r>
           </w:p>
         </w:tc>
         <w:tc>
           <w:tcPr>
-            <w:tcW w:type="dxa" w:w="4896"/>
+            <w:tcW w:type="dxa" w:w="3312"/>
           </w:tcPr>
           <w:p>
             <w:r/>
@@ -2573,7 +2873,7 @@
                 <w:b w:val="0"/>
                 <w:sz w:val="20"/>
               </w:rPr>
-              <w:t>(a) Discharge blocked, grid exceeds peak limit, Low SOC alarm.</w:t>
+              <w:t>Verify:</w:t>
             </w:r>
           </w:p>
           <w:p>
@@ -2582,7 +2882,7 @@
                 <w:b w:val="0"/>
                 <w:sz w:val="20"/>
               </w:rPr>
-              <w:t>(b) Battery allowed to discharge, no charge command.</w:t>
+              <w:t>(a) SOC = 10%, load exceeds peak;</w:t>
             </w:r>
           </w:p>
           <w:p>
@@ -2591,7 +2891,7 @@
                 <w:b w:val="0"/>
                 <w:sz w:val="20"/>
               </w:rPr>
-              <w:t>(c) Battery automatically resumes discharge.</w:t>
+              <w:t>(b) SOC = 100%, peak load;</w:t>
             </w:r>
           </w:p>
           <w:p>
@@ -2600,7 +2900,7 @@
                 <w:b w:val="0"/>
                 <w:sz w:val="20"/>
               </w:rPr>
-              <w:t>(d) PLC allocates more discharge to higher-SOC units per balancing algorithm.</w:t>
+              <w:t>(c) SOC recovers above minimum;</w:t>
             </w:r>
           </w:p>
           <w:p>
@@ -2609,13 +2909,73 @@
                 <w:b w:val="0"/>
                 <w:sz w:val="20"/>
               </w:rPr>
-              <w:t>(e) Equal power sharing.</w:t>
+              <w:t>(d) unequal SOC 95/70/40%, 150 kW;</w:t>
+            </w:r>
+          </w:p>
+          <w:p>
+            <w:r>
+              <w:rPr>
+                <w:b w:val="0"/>
+                <w:sz w:val="20"/>
+              </w:rPr>
+              <w:t>(e) all SOC equal (80%).</w:t>
             </w:r>
           </w:p>
         </w:tc>
         <w:tc>
           <w:tcPr>
-            <w:tcW w:type="dxa" w:w="1296"/>
+            <w:tcW w:type="dxa" w:w="3744"/>
+          </w:tcPr>
+          <w:p>
+            <w:r/>
+            <w:r>
+              <w:rPr>
+                <w:b w:val="0"/>
+                <w:sz w:val="20"/>
+              </w:rPr>
+              <w:t>(a) Discharge blocked, grid exceeds peak limit, Low SOC alarm.</w:t>
+            </w:r>
+          </w:p>
+          <w:p>
+            <w:r>
+              <w:rPr>
+                <w:b w:val="0"/>
+                <w:sz w:val="20"/>
+              </w:rPr>
+              <w:t>(b) Battery allowed to discharge, no charge command.</w:t>
+            </w:r>
+          </w:p>
+          <w:p>
+            <w:r>
+              <w:rPr>
+                <w:b w:val="0"/>
+                <w:sz w:val="20"/>
+              </w:rPr>
+              <w:t>(c) Battery automatically resumes discharge.</w:t>
+            </w:r>
+          </w:p>
+          <w:p>
+            <w:r>
+              <w:rPr>
+                <w:b w:val="0"/>
+                <w:sz w:val="20"/>
+              </w:rPr>
+              <w:t>(d) PLC allocates more discharge to higher-SOC units per balancing algorithm.</w:t>
+            </w:r>
+          </w:p>
+          <w:p>
+            <w:r>
+              <w:rPr>
+                <w:b w:val="0"/>
+                <w:sz w:val="20"/>
+              </w:rPr>
+              <w:t>(e) Equal power sharing.</w:t>
+            </w:r>
+          </w:p>
+        </w:tc>
+        <w:tc>
+          <w:tcPr>
+            <w:tcW w:type="dxa" w:w="1152"/>
           </w:tcPr>
           <w:p>
             <w:pPr>
@@ -2632,7 +2992,7 @@
         </w:tc>
         <w:tc>
           <w:tcPr>
-            <w:tcW w:type="dxa" w:w="1728"/>
+            <w:tcW w:type="dxa" w:w="1440"/>
           </w:tcPr>
           <w:p>
             <w:r/>
@@ -2648,7 +3008,7 @@
       <w:tr>
         <w:tc>
           <w:tcPr>
-            <w:tcW w:type="dxa" w:w="2736"/>
+            <w:tcW w:type="dxa" w:w="2016"/>
           </w:tcPr>
           <w:p>
             <w:r/>
@@ -2658,21 +3018,12 @@
                 <w:sz w:val="20"/>
               </w:rPr>
               <w:t>3.7 SOC Protection Limits (grouped)</w:t>
-            </w:r>
-          </w:p>
-          <w:p>
-            <w:r>
-              <w:rPr>
-                <w:b/>
-                <w:sz w:val="20"/>
-              </w:rPr>
-              <w:t>(a) Reduce all units below min SOC (≈10%), command 300 kW discharge; (b) raise all units to max SOC (≈100%), command 300 kW charge.</w:t>
             </w:r>
           </w:p>
         </w:tc>
         <w:tc>
           <w:tcPr>
-            <w:tcW w:type="dxa" w:w="4896"/>
+            <w:tcW w:type="dxa" w:w="3312"/>
           </w:tcPr>
           <w:p>
             <w:r/>
@@ -2681,7 +3032,7 @@
                 <w:b w:val="0"/>
                 <w:sz w:val="20"/>
               </w:rPr>
-              <w:t>(a) Discharge blocked, Low SOC alarm active, no battery damage.</w:t>
+              <w:t>(a) Reduce all units below min SOC (≈10%), command 300 kW discharge;</w:t>
             </w:r>
           </w:p>
           <w:p>
@@ -2690,13 +3041,37 @@
                 <w:b w:val="0"/>
                 <w:sz w:val="20"/>
               </w:rPr>
-              <w:t>(b) Charging blocked, High SOC alarm active.</w:t>
+              <w:t>(b) raise all units to max SOC (≈100%), command 300 kW charge.</w:t>
             </w:r>
           </w:p>
         </w:tc>
         <w:tc>
           <w:tcPr>
-            <w:tcW w:type="dxa" w:w="1296"/>
+            <w:tcW w:type="dxa" w:w="3744"/>
+          </w:tcPr>
+          <w:p>
+            <w:r/>
+            <w:r>
+              <w:rPr>
+                <w:b w:val="0"/>
+                <w:sz w:val="20"/>
+              </w:rPr>
+              <w:t>(a) Discharge blocked, Low SOC alarm active, no battery damage.</w:t>
+            </w:r>
+          </w:p>
+          <w:p>
+            <w:r>
+              <w:rPr>
+                <w:b w:val="0"/>
+                <w:sz w:val="20"/>
+              </w:rPr>
+              <w:t>(b) Charging blocked, High SOC alarm active.</w:t>
+            </w:r>
+          </w:p>
+        </w:tc>
+        <w:tc>
+          <w:tcPr>
+            <w:tcW w:type="dxa" w:w="1152"/>
           </w:tcPr>
           <w:p>
             <w:pPr>
@@ -2713,7 +3088,7 @@
         </w:tc>
         <w:tc>
           <w:tcPr>
-            <w:tcW w:type="dxa" w:w="1728"/>
+            <w:tcW w:type="dxa" w:w="1440"/>
           </w:tcPr>
           <w:p>
             <w:r/>
@@ -2729,7 +3104,7 @@
       <w:tr>
         <w:tc>
           <w:tcPr>
-            <w:tcW w:type="dxa" w:w="2736"/>
+            <w:tcW w:type="dxa" w:w="2016"/>
           </w:tcPr>
           <w:p>
             <w:r/>
@@ -2739,21 +3114,12 @@
                 <w:sz w:val="20"/>
               </w:rPr>
               <w:t>3.8 Grid Meter Failure &amp; Recovery</w:t>
-            </w:r>
-          </w:p>
-          <w:p>
-            <w:r>
-              <w:rPr>
-                <w:b/>
-                <w:sz w:val="20"/>
-              </w:rPr>
-              <w:t>Disconnect the grid meter, then reconnect it.</w:t>
             </w:r>
           </w:p>
         </w:tc>
         <w:tc>
           <w:tcPr>
-            <w:tcW w:type="dxa" w:w="4896"/>
+            <w:tcW w:type="dxa" w:w="3312"/>
           </w:tcPr>
           <w:p>
             <w:r/>
@@ -2762,13 +3128,28 @@
                 <w:b w:val="0"/>
                 <w:sz w:val="20"/>
               </w:rPr>
-              <w:t>On failure: PLC detects the meter fault, Peak Shaving disabled or enters configured fallback (fixed charge/discharge power), alarm generated. On recovery: automatic recovery, Peak Shaving resumes with the latest settings.</w:t>
+              <w:t>Disconnect the grid meter, then reconnect it.</w:t>
             </w:r>
           </w:p>
         </w:tc>
         <w:tc>
           <w:tcPr>
-            <w:tcW w:type="dxa" w:w="1296"/>
+            <w:tcW w:type="dxa" w:w="3744"/>
+          </w:tcPr>
+          <w:p>
+            <w:r/>
+            <w:r>
+              <w:rPr>
+                <w:b w:val="0"/>
+                <w:sz w:val="20"/>
+              </w:rPr>
+              <w:t>On failure: PLC detects the meter fault, Peak Shaving disabled or enters configured fallback (fixed charge/discharge power), alarm generated. On recovery: automatic recovery, Peak Shaving resumes with the latest settings.</w:t>
+            </w:r>
+          </w:p>
+        </w:tc>
+        <w:tc>
+          <w:tcPr>
+            <w:tcW w:type="dxa" w:w="1152"/>
           </w:tcPr>
           <w:p>
             <w:pPr>
@@ -2785,7 +3166,7 @@
         </w:tc>
         <w:tc>
           <w:tcPr>
-            <w:tcW w:type="dxa" w:w="1728"/>
+            <w:tcW w:type="dxa" w:w="1440"/>
           </w:tcPr>
           <w:p>
             <w:r/>
@@ -2801,7 +3182,7 @@
       <w:tr>
         <w:tc>
           <w:tcPr>
-            <w:tcW w:type="dxa" w:w="2736"/>
+            <w:tcW w:type="dxa" w:w="2016"/>
           </w:tcPr>
           <w:p>
             <w:r/>
@@ -2811,21 +3192,12 @@
                 <w:sz w:val="20"/>
               </w:rPr>
               <w:t>3.9 PLC Restart During Peak Shaving</w:t>
-            </w:r>
-          </w:p>
-          <w:p>
-            <w:r>
-              <w:rPr>
-                <w:b/>
-                <w:sz w:val="20"/>
-              </w:rPr>
-              <w:t>Restart / disconnect the PLC while units are operating.</w:t>
             </w:r>
           </w:p>
         </w:tc>
         <w:tc>
           <w:tcPr>
-            <w:tcW w:type="dxa" w:w="4896"/>
+            <w:tcW w:type="dxa" w:w="3312"/>
           </w:tcPr>
           <w:p>
             <w:r/>
@@ -2834,13 +3206,28 @@
                 <w:b w:val="0"/>
                 <w:sz w:val="20"/>
               </w:rPr>
-              <w:t>Controlled restart; no unsafe battery operation; Peak Shaving resumes after initialization.</w:t>
+              <w:t>Restart / disconnect the PLC while units are operating.</w:t>
             </w:r>
           </w:p>
         </w:tc>
         <w:tc>
           <w:tcPr>
-            <w:tcW w:type="dxa" w:w="1296"/>
+            <w:tcW w:type="dxa" w:w="3744"/>
+          </w:tcPr>
+          <w:p>
+            <w:r/>
+            <w:r>
+              <w:rPr>
+                <w:b w:val="0"/>
+                <w:sz w:val="20"/>
+              </w:rPr>
+              <w:t>Controlled restart; no unsafe battery operation; Peak Shaving resumes after initialization.</w:t>
+            </w:r>
+          </w:p>
+        </w:tc>
+        <w:tc>
+          <w:tcPr>
+            <w:tcW w:type="dxa" w:w="1152"/>
           </w:tcPr>
           <w:p>
             <w:pPr>
@@ -2857,7 +3244,7 @@
         </w:tc>
         <w:tc>
           <w:tcPr>
-            <w:tcW w:type="dxa" w:w="1728"/>
+            <w:tcW w:type="dxa" w:w="1440"/>
           </w:tcPr>
           <w:p>
             <w:r/>
@@ -2873,7 +3260,7 @@
       <w:tr>
         <w:tc>
           <w:tcPr>
-            <w:tcW w:type="dxa" w:w="2736"/>
+            <w:tcW w:type="dxa" w:w="2016"/>
           </w:tcPr>
           <w:p>
             <w:r/>
@@ -2883,21 +3270,12 @@
                 <w:sz w:val="20"/>
               </w:rPr>
               <w:t>3.10 Unit Communication Loss</w:t>
-            </w:r>
-          </w:p>
-          <w:p>
-            <w:r>
-              <w:rPr>
-                <w:b/>
-                <w:sz w:val="20"/>
-              </w:rPr>
-              <w:t>Disconnect Unit 2 during Peak Shaving.</w:t>
             </w:r>
           </w:p>
         </w:tc>
         <w:tc>
           <w:tcPr>
-            <w:tcW w:type="dxa" w:w="4896"/>
+            <w:tcW w:type="dxa" w:w="3312"/>
           </w:tcPr>
           <w:p>
             <w:r/>
@@ -2906,13 +3284,28 @@
                 <w:b w:val="0"/>
                 <w:sz w:val="20"/>
               </w:rPr>
-              <w:t>Unit removed from control; remaining units continue; alarm generated.</w:t>
+              <w:t>Disconnect Unit 2 during Peak Shaving.</w:t>
             </w:r>
           </w:p>
         </w:tc>
         <w:tc>
           <w:tcPr>
-            <w:tcW w:type="dxa" w:w="1296"/>
+            <w:tcW w:type="dxa" w:w="3744"/>
+          </w:tcPr>
+          <w:p>
+            <w:r/>
+            <w:r>
+              <w:rPr>
+                <w:b w:val="0"/>
+                <w:sz w:val="20"/>
+              </w:rPr>
+              <w:t>Unit removed from control; remaining units continue; alarm generated.</w:t>
+            </w:r>
+          </w:p>
+        </w:tc>
+        <w:tc>
+          <w:tcPr>
+            <w:tcW w:type="dxa" w:w="1152"/>
           </w:tcPr>
           <w:p>
             <w:pPr>
@@ -2929,7 +3322,7 @@
         </w:tc>
         <w:tc>
           <w:tcPr>
-            <w:tcW w:type="dxa" w:w="1728"/>
+            <w:tcW w:type="dxa" w:w="1440"/>
           </w:tcPr>
           <w:p>
             <w:r/>
@@ -2945,7 +3338,7 @@
       <w:tr>
         <w:tc>
           <w:tcPr>
-            <w:tcW w:type="dxa" w:w="2736"/>
+            <w:tcW w:type="dxa" w:w="2016"/>
           </w:tcPr>
           <w:p>
             <w:r/>
@@ -2955,21 +3348,12 @@
                 <w:sz w:val="20"/>
               </w:rPr>
               <w:t>3.11 PCS Fault During Peak</w:t>
-            </w:r>
-          </w:p>
-          <w:p>
-            <w:r>
-              <w:rPr>
-                <w:b/>
-                <w:sz w:val="20"/>
-              </w:rPr>
-              <w:t>Trip Unit 3 during Peak Shaving.</w:t>
             </w:r>
           </w:p>
         </w:tc>
         <w:tc>
           <w:tcPr>
-            <w:tcW w:type="dxa" w:w="4896"/>
+            <w:tcW w:type="dxa" w:w="3312"/>
           </w:tcPr>
           <w:p>
             <w:r/>
@@ -2978,13 +3362,28 @@
                 <w:b w:val="0"/>
                 <w:sz w:val="20"/>
               </w:rPr>
-              <w:t>Remaining units continue; power redistributed automatically.</w:t>
+              <w:t>Trip Unit 3 during Peak Shaving.</w:t>
             </w:r>
           </w:p>
         </w:tc>
         <w:tc>
           <w:tcPr>
-            <w:tcW w:type="dxa" w:w="1296"/>
+            <w:tcW w:type="dxa" w:w="3744"/>
+          </w:tcPr>
+          <w:p>
+            <w:r/>
+            <w:r>
+              <w:rPr>
+                <w:b w:val="0"/>
+                <w:sz w:val="20"/>
+              </w:rPr>
+              <w:t>Remaining units continue; power redistributed automatically.</w:t>
+            </w:r>
+          </w:p>
+        </w:tc>
+        <w:tc>
+          <w:tcPr>
+            <w:tcW w:type="dxa" w:w="1152"/>
           </w:tcPr>
           <w:p>
             <w:pPr>
@@ -3001,7 +3400,7 @@
         </w:tc>
         <w:tc>
           <w:tcPr>
-            <w:tcW w:type="dxa" w:w="1728"/>
+            <w:tcW w:type="dxa" w:w="1440"/>
           </w:tcPr>
           <w:p>
             <w:r/>
@@ -3017,7 +3416,7 @@
       <w:tr>
         <w:tc>
           <w:tcPr>
-            <w:tcW w:type="dxa" w:w="2736"/>
+            <w:tcW w:type="dxa" w:w="2016"/>
           </w:tcPr>
           <w:p>
             <w:r/>
@@ -3027,21 +3426,12 @@
                 <w:sz w:val="20"/>
               </w:rPr>
               <w:t>3.12 Maximum Ramp Test</w:t>
-            </w:r>
-          </w:p>
-          <w:p>
-            <w:r>
-              <w:rPr>
-                <w:b/>
-                <w:sz w:val="20"/>
-              </w:rPr>
-              <w:t>Increase load 100 → 450 kW.</w:t>
             </w:r>
           </w:p>
         </w:tc>
         <w:tc>
           <w:tcPr>
-            <w:tcW w:type="dxa" w:w="4896"/>
+            <w:tcW w:type="dxa" w:w="3312"/>
           </w:tcPr>
           <w:p>
             <w:r/>
@@ -3050,13 +3440,28 @@
                 <w:b w:val="0"/>
                 <w:sz w:val="20"/>
               </w:rPr>
-              <w:t>Battery reaches maximum output without oscillation.</w:t>
+              <w:t>Increase load 100 → 450 kW.</w:t>
             </w:r>
           </w:p>
         </w:tc>
         <w:tc>
           <w:tcPr>
-            <w:tcW w:type="dxa" w:w="1296"/>
+            <w:tcW w:type="dxa" w:w="3744"/>
+          </w:tcPr>
+          <w:p>
+            <w:r/>
+            <w:r>
+              <w:rPr>
+                <w:b w:val="0"/>
+                <w:sz w:val="20"/>
+              </w:rPr>
+              <w:t>Battery reaches maximum output without oscillation.</w:t>
+            </w:r>
+          </w:p>
+        </w:tc>
+        <w:tc>
+          <w:tcPr>
+            <w:tcW w:type="dxa" w:w="1152"/>
           </w:tcPr>
           <w:p>
             <w:pPr>
@@ -3073,7 +3478,7 @@
         </w:tc>
         <w:tc>
           <w:tcPr>
-            <w:tcW w:type="dxa" w:w="1728"/>
+            <w:tcW w:type="dxa" w:w="1440"/>
           </w:tcPr>
           <w:p>
             <w:r/>
@@ -3089,7 +3494,7 @@
       <w:tr>
         <w:tc>
           <w:tcPr>
-            <w:tcW w:type="dxa" w:w="2736"/>
+            <w:tcW w:type="dxa" w:w="2016"/>
           </w:tcPr>
           <w:p>
             <w:r/>
@@ -3099,21 +3504,12 @@
                 <w:sz w:val="20"/>
               </w:rPr>
               <w:t>3.13 Peak Limit Change During Operation (grouped)</w:t>
-            </w:r>
-          </w:p>
-          <w:p>
-            <w:r>
-              <w:rPr>
-                <w:b/>
-                <w:sz w:val="20"/>
-              </w:rPr>
-              <w:t>(a) Lower limit 150 → 100 kW; (b) raise limit 100 → 200 kW.</w:t>
             </w:r>
           </w:p>
         </w:tc>
         <w:tc>
           <w:tcPr>
-            <w:tcW w:type="dxa" w:w="4896"/>
+            <w:tcW w:type="dxa" w:w="3312"/>
           </w:tcPr>
           <w:p>
             <w:r/>
@@ -3122,7 +3518,7 @@
                 <w:b w:val="0"/>
                 <w:sz w:val="20"/>
               </w:rPr>
-              <w:t>(a) Battery increases discharge smoothly, no instability.</w:t>
+              <w:t>(a) Lower limit 150 → 100 kW;</w:t>
             </w:r>
           </w:p>
           <w:p>
@@ -3131,13 +3527,37 @@
                 <w:b w:val="0"/>
                 <w:sz w:val="20"/>
               </w:rPr>
-              <w:t>(b) Battery reduces output accordingly.</w:t>
+              <w:t>(b) raise limit 100 → 200 kW.</w:t>
             </w:r>
           </w:p>
         </w:tc>
         <w:tc>
           <w:tcPr>
-            <w:tcW w:type="dxa" w:w="1296"/>
+            <w:tcW w:type="dxa" w:w="3744"/>
+          </w:tcPr>
+          <w:p>
+            <w:r/>
+            <w:r>
+              <w:rPr>
+                <w:b w:val="0"/>
+                <w:sz w:val="20"/>
+              </w:rPr>
+              <w:t>(a) Battery increases discharge smoothly, no instability.</w:t>
+            </w:r>
+          </w:p>
+          <w:p>
+            <w:r>
+              <w:rPr>
+                <w:b w:val="0"/>
+                <w:sz w:val="20"/>
+              </w:rPr>
+              <w:t>(b) Battery reduces output accordingly.</w:t>
+            </w:r>
+          </w:p>
+        </w:tc>
+        <w:tc>
+          <w:tcPr>
+            <w:tcW w:type="dxa" w:w="1152"/>
           </w:tcPr>
           <w:p>
             <w:pPr>
@@ -3154,7 +3574,7 @@
         </w:tc>
         <w:tc>
           <w:tcPr>
-            <w:tcW w:type="dxa" w:w="1728"/>
+            <w:tcW w:type="dxa" w:w="1440"/>
           </w:tcPr>
           <w:p>
             <w:r/>
@@ -3170,7 +3590,7 @@
       <w:tr>
         <w:tc>
           <w:tcPr>
-            <w:tcW w:type="dxa" w:w="2736"/>
+            <w:tcW w:type="dxa" w:w="2016"/>
           </w:tcPr>
           <w:p>
             <w:r/>
@@ -3180,21 +3600,12 @@
                 <w:sz w:val="20"/>
               </w:rPr>
               <w:t>3.14 Disable Peak Shaving</w:t>
-            </w:r>
-          </w:p>
-          <w:p>
-            <w:r>
-              <w:rPr>
-                <w:b/>
-                <w:sz w:val="20"/>
-              </w:rPr>
-              <w:t>Disable Peak Shaving while operating.</w:t>
             </w:r>
           </w:p>
         </w:tc>
         <w:tc>
           <w:tcPr>
-            <w:tcW w:type="dxa" w:w="4896"/>
+            <w:tcW w:type="dxa" w:w="3312"/>
           </w:tcPr>
           <w:p>
             <w:r/>
@@ -3203,13 +3614,28 @@
                 <w:b w:val="0"/>
                 <w:sz w:val="20"/>
               </w:rPr>
-              <w:t>Battery ramps to zero output; grid supplies the full site load; no alarms or abrupt power changes.</w:t>
+              <w:t>Disable Peak Shaving while operating.</w:t>
             </w:r>
           </w:p>
         </w:tc>
         <w:tc>
           <w:tcPr>
-            <w:tcW w:type="dxa" w:w="1296"/>
+            <w:tcW w:type="dxa" w:w="3744"/>
+          </w:tcPr>
+          <w:p>
+            <w:r/>
+            <w:r>
+              <w:rPr>
+                <w:b w:val="0"/>
+                <w:sz w:val="20"/>
+              </w:rPr>
+              <w:t>Battery ramps to zero output; grid supplies the full site load; no alarms or abrupt power changes.</w:t>
+            </w:r>
+          </w:p>
+        </w:tc>
+        <w:tc>
+          <w:tcPr>
+            <w:tcW w:type="dxa" w:w="1152"/>
           </w:tcPr>
           <w:p>
             <w:pPr>
@@ -3226,7 +3652,7 @@
         </w:tc>
         <w:tc>
           <w:tcPr>
-            <w:tcW w:type="dxa" w:w="1728"/>
+            <w:tcW w:type="dxa" w:w="1440"/>
           </w:tcPr>
           <w:p>
             <w:r/>
@@ -3275,15 +3701,16 @@
         <w:tblLook w:firstColumn="1" w:firstRow="1" w:lastColumn="0" w:lastRow="0" w:noHBand="0" w:noVBand="1" w:val="04A0"/>
       </w:tblPr>
       <w:tblGrid>
-        <w:gridCol w:w="2160"/>
-        <w:gridCol w:w="2160"/>
-        <w:gridCol w:w="2160"/>
-        <w:gridCol w:w="2160"/>
+        <w:gridCol w:w="1728"/>
+        <w:gridCol w:w="1728"/>
+        <w:gridCol w:w="1728"/>
+        <w:gridCol w:w="1728"/>
+        <w:gridCol w:w="1728"/>
       </w:tblGrid>
       <w:tr>
         <w:tc>
           <w:tcPr>
-            <w:tcW w:type="dxa" w:w="2736"/>
+            <w:tcW w:type="dxa" w:w="2016"/>
             <w:shd w:val="clear" w:color="auto" w:fill="1F4E79"/>
           </w:tcPr>
           <w:p>
@@ -3303,7 +3730,7 @@
         </w:tc>
         <w:tc>
           <w:tcPr>
-            <w:tcW w:type="dxa" w:w="4896"/>
+            <w:tcW w:type="dxa" w:w="3312"/>
             <w:shd w:val="clear" w:color="auto" w:fill="1F4E79"/>
           </w:tcPr>
           <w:p>
@@ -3317,13 +3744,13 @@
                 <w:color w:val="FFFFFF"/>
                 <w:sz w:val="20"/>
               </w:rPr>
-              <w:t>Expected Results</w:t>
+              <w:t>Procedure</w:t>
             </w:r>
           </w:p>
         </w:tc>
         <w:tc>
           <w:tcPr>
-            <w:tcW w:type="dxa" w:w="1296"/>
+            <w:tcW w:type="dxa" w:w="3744"/>
             <w:shd w:val="clear" w:color="auto" w:fill="1F4E79"/>
           </w:tcPr>
           <w:p>
@@ -3337,13 +3764,33 @@
                 <w:color w:val="FFFFFF"/>
                 <w:sz w:val="20"/>
               </w:rPr>
-              <w:t>Approved</w:t>
-            </w:r>
-          </w:p>
+              <w:t>Expected Results</w:t>
+            </w:r>
+          </w:p>
+        </w:tc>
+        <w:tc>
+          <w:tcPr>
+            <w:tcW w:type="dxa" w:w="1152"/>
+            <w:shd w:val="clear" w:color="auto" w:fill="1F4E79"/>
+          </w:tcPr>
           <w:p>
             <w:pPr>
               <w:jc w:val="center"/>
             </w:pPr>
+            <w:r/>
+            <w:r>
+              <w:rPr>
+                <w:b/>
+                <w:color w:val="FFFFFF"/>
+                <w:sz w:val="20"/>
+              </w:rPr>
+              <w:t>Approved</w:t>
+            </w:r>
+          </w:p>
+          <w:p>
+            <w:pPr>
+              <w:jc w:val="center"/>
+            </w:pPr>
             <w:r>
               <w:rPr>
                 <w:b/>
@@ -3356,7 +3803,7 @@
         </w:tc>
         <w:tc>
           <w:tcPr>
-            <w:tcW w:type="dxa" w:w="1728"/>
+            <w:tcW w:type="dxa" w:w="1440"/>
             <w:shd w:val="clear" w:color="auto" w:fill="1F4E79"/>
           </w:tcPr>
           <w:p>
@@ -3378,7 +3825,7 @@
       <w:tr>
         <w:tc>
           <w:tcPr>
-            <w:tcW w:type="dxa" w:w="2736"/>
+            <w:tcW w:type="dxa" w:w="2016"/>
           </w:tcPr>
           <w:p>
             <w:r/>
@@ -3388,21 +3835,12 @@
                 <w:sz w:val="20"/>
               </w:rPr>
               <w:t>4.1 Enable Idle Charging &amp; Charge to Target (grouped)</w:t>
-            </w:r>
-          </w:p>
-          <w:p>
-            <w:r>
-              <w:rPr>
-                <w:b/>
-                <w:sz w:val="20"/>
-              </w:rPr>
-              <w:t>Enable Peak Shaving and Idle Charging; Target SOC = 80%; all units SOC = 50%; load = 80 kW; Peak = 150 kW. Allow charging to 80%, then reduce SOC to 75%.</w:t>
             </w:r>
           </w:p>
         </w:tc>
         <w:tc>
           <w:tcPr>
-            <w:tcW w:type="dxa" w:w="4896"/>
+            <w:tcW w:type="dxa" w:w="3312"/>
           </w:tcPr>
           <w:p>
             <w:r/>
@@ -3411,13 +3849,28 @@
                 <w:b w:val="0"/>
                 <w:sz w:val="20"/>
               </w:rPr>
-              <w:t>Idle Charging enabled; charging starts automatically; PLC calculates available charging power (150 − 80 = 70 kW); no alarms. At 80% target: charge command → 0 kW, SOC stable, BESS online and ready. At 75%: charging resumes automatically.</w:t>
+              <w:t>Enable Peak Shaving and Idle Charging; Target SOC = 80%; all units SOC = 50%; load = 80 kW; Peak = 150 kW. Allow charging to 80%, then reduce SOC to 75%.</w:t>
             </w:r>
           </w:p>
         </w:tc>
         <w:tc>
           <w:tcPr>
-            <w:tcW w:type="dxa" w:w="1296"/>
+            <w:tcW w:type="dxa" w:w="3744"/>
+          </w:tcPr>
+          <w:p>
+            <w:r/>
+            <w:r>
+              <w:rPr>
+                <w:b w:val="0"/>
+                <w:sz w:val="20"/>
+              </w:rPr>
+              <w:t>Idle Charging enabled; charging starts automatically; PLC calculates available charging power (150 − 80 = 70 kW); no alarms. At 80% target: charge command → 0 kW, SOC stable, BESS online and ready. At 75%: charging resumes automatically.</w:t>
+            </w:r>
+          </w:p>
+        </w:tc>
+        <w:tc>
+          <w:tcPr>
+            <w:tcW w:type="dxa" w:w="1152"/>
           </w:tcPr>
           <w:p>
             <w:pPr>
@@ -3434,7 +3887,7 @@
         </w:tc>
         <w:tc>
           <w:tcPr>
-            <w:tcW w:type="dxa" w:w="1728"/>
+            <w:tcW w:type="dxa" w:w="1440"/>
           </w:tcPr>
           <w:p>
             <w:r/>
@@ -3450,7 +3903,7 @@
       <w:tr>
         <w:tc>
           <w:tcPr>
-            <w:tcW w:type="dxa" w:w="2736"/>
+            <w:tcW w:type="dxa" w:w="2016"/>
           </w:tcPr>
           <w:p>
             <w:r/>
@@ -3460,21 +3913,12 @@
                 <w:sz w:val="20"/>
               </w:rPr>
               <w:t>4.2 Target SOC Changes (grouped)</w:t>
-            </w:r>
-          </w:p>
-          <w:p>
-            <w:r>
-              <w:rPr>
-                <w:b/>
-                <w:sz w:val="20"/>
-              </w:rPr>
-              <w:t>While charging: (a) raise Target 80 → 90%; (b) lower Target to 70%; (c) change Target 80 → 60 → 95% in operation.</w:t>
             </w:r>
           </w:p>
         </w:tc>
         <w:tc>
           <w:tcPr>
-            <w:tcW w:type="dxa" w:w="4896"/>
+            <w:tcW w:type="dxa" w:w="3312"/>
           </w:tcPr>
           <w:p>
             <w:r/>
@@ -3483,7 +3927,7 @@
                 <w:b w:val="0"/>
                 <w:sz w:val="20"/>
               </w:rPr>
-              <w:t>(a) Charging continues until the new target is reached.</w:t>
+              <w:t>While charging:</w:t>
             </w:r>
           </w:p>
           <w:p>
@@ -3492,7 +3936,7 @@
                 <w:b w:val="0"/>
                 <w:sz w:val="20"/>
               </w:rPr>
-              <w:t>(b) Charging stops immediately; if possible the system discharges to reach the target (requires grid limit ≠ 0).</w:t>
+              <w:t>(a) raise Target 80 → 90%;</w:t>
             </w:r>
           </w:p>
           <w:p>
@@ -3501,13 +3945,55 @@
                 <w:b w:val="0"/>
                 <w:sz w:val="20"/>
               </w:rPr>
-              <w:t>(c) PLC immediately applies each new Target SOC, starting/stopping charging as required without instability.</w:t>
+              <w:t>(b) lower Target to 70%;</w:t>
+            </w:r>
+          </w:p>
+          <w:p>
+            <w:r>
+              <w:rPr>
+                <w:b w:val="0"/>
+                <w:sz w:val="20"/>
+              </w:rPr>
+              <w:t>(c) change Target 80 → 60 → 95% in operation.</w:t>
             </w:r>
           </w:p>
         </w:tc>
         <w:tc>
           <w:tcPr>
-            <w:tcW w:type="dxa" w:w="1296"/>
+            <w:tcW w:type="dxa" w:w="3744"/>
+          </w:tcPr>
+          <w:p>
+            <w:r/>
+            <w:r>
+              <w:rPr>
+                <w:b w:val="0"/>
+                <w:sz w:val="20"/>
+              </w:rPr>
+              <w:t>(a) Charging continues until the new target is reached.</w:t>
+            </w:r>
+          </w:p>
+          <w:p>
+            <w:r>
+              <w:rPr>
+                <w:b w:val="0"/>
+                <w:sz w:val="20"/>
+              </w:rPr>
+              <w:t>(b) Charging stops immediately; if possible the system discharges to reach the target (requires grid limit ≠ 0).</w:t>
+            </w:r>
+          </w:p>
+          <w:p>
+            <w:r>
+              <w:rPr>
+                <w:b w:val="0"/>
+                <w:sz w:val="20"/>
+              </w:rPr>
+              <w:t>(c) PLC immediately applies each new Target SOC, starting/stopping charging as required without instability.</w:t>
+            </w:r>
+          </w:p>
+        </w:tc>
+        <w:tc>
+          <w:tcPr>
+            <w:tcW w:type="dxa" w:w="1152"/>
           </w:tcPr>
           <w:p>
             <w:pPr>
@@ -3524,7 +4010,7 @@
         </w:tc>
         <w:tc>
           <w:tcPr>
-            <w:tcW w:type="dxa" w:w="1728"/>
+            <w:tcW w:type="dxa" w:w="1440"/>
           </w:tcPr>
           <w:p>
             <w:r/>
@@ -3540,7 +4026,7 @@
       <w:tr>
         <w:tc>
           <w:tcPr>
-            <w:tcW w:type="dxa" w:w="2736"/>
+            <w:tcW w:type="dxa" w:w="2016"/>
           </w:tcPr>
           <w:p>
             <w:r/>
@@ -3550,21 +4036,12 @@
                 <w:sz w:val="20"/>
               </w:rPr>
               <w:t>4.3 Peak Interaction During Charging (grouped)</w:t>
-            </w:r>
-          </w:p>
-          <w:p>
-            <w:r>
-              <w:rPr>
-                <w:b/>
-                <w:sz w:val="20"/>
-              </w:rPr>
-              <w:t>(a) Charging at 120 kW, increase load 80 → 220 kW; (b) reduce load 220 → 80 kW with SOC still below target; (c) alternate load 80/220 kW every 15 s.</w:t>
             </w:r>
           </w:p>
         </w:tc>
         <w:tc>
           <w:tcPr>
-            <w:tcW w:type="dxa" w:w="4896"/>
+            <w:tcW w:type="dxa" w:w="3312"/>
           </w:tcPr>
           <w:p>
             <w:r/>
@@ -3573,7 +4050,7 @@
                 <w:b w:val="0"/>
                 <w:sz w:val="20"/>
               </w:rPr>
-              <w:t>(a) Charging stops immediately, battery transitions to discharge, grid held at Peak Limit, no oscillation.</w:t>
+              <w:t>(a) Charging at 120 kW, increase load 80 → 220 kW;</w:t>
             </w:r>
           </w:p>
           <w:p>
@@ -3582,7 +4059,7 @@
                 <w:b w:val="0"/>
                 <w:sz w:val="20"/>
               </w:rPr>
-              <w:t>(b) Battery automatically resumes charging.</w:t>
+              <w:t>(b) reduce load 220 → 80 kW with SOC still below target;</w:t>
             </w:r>
           </w:p>
           <w:p>
@@ -3591,13 +4068,46 @@
                 <w:b w:val="0"/>
                 <w:sz w:val="20"/>
               </w:rPr>
-              <w:t>(c) PLC correctly alternates between charging and discharging, no instability.</w:t>
+              <w:t>(c) alternate load 80/220 kW every 15 s.</w:t>
             </w:r>
           </w:p>
         </w:tc>
         <w:tc>
           <w:tcPr>
-            <w:tcW w:type="dxa" w:w="1296"/>
+            <w:tcW w:type="dxa" w:w="3744"/>
+          </w:tcPr>
+          <w:p>
+            <w:r/>
+            <w:r>
+              <w:rPr>
+                <w:b w:val="0"/>
+                <w:sz w:val="20"/>
+              </w:rPr>
+              <w:t>(a) Charging stops immediately, battery transitions to discharge, grid held at Peak Limit, no oscillation.</w:t>
+            </w:r>
+          </w:p>
+          <w:p>
+            <w:r>
+              <w:rPr>
+                <w:b w:val="0"/>
+                <w:sz w:val="20"/>
+              </w:rPr>
+              <w:t>(b) Battery automatically resumes charging.</w:t>
+            </w:r>
+          </w:p>
+          <w:p>
+            <w:r>
+              <w:rPr>
+                <w:b w:val="0"/>
+                <w:sz w:val="20"/>
+              </w:rPr>
+              <w:t>(c) PLC correctly alternates between charging and discharging, no instability.</w:t>
+            </w:r>
+          </w:p>
+        </w:tc>
+        <w:tc>
+          <w:tcPr>
+            <w:tcW w:type="dxa" w:w="1152"/>
           </w:tcPr>
           <w:p>
             <w:pPr>
@@ -3614,7 +4124,7 @@
         </w:tc>
         <w:tc>
           <w:tcPr>
-            <w:tcW w:type="dxa" w:w="1728"/>
+            <w:tcW w:type="dxa" w:w="1440"/>
           </w:tcPr>
           <w:p>
             <w:r/>
@@ -3630,7 +4140,7 @@
       <w:tr>
         <w:tc>
           <w:tcPr>
-            <w:tcW w:type="dxa" w:w="2736"/>
+            <w:tcW w:type="dxa" w:w="2016"/>
           </w:tcPr>
           <w:p>
             <w:r/>
@@ -3640,21 +4150,12 @@
                 <w:sz w:val="20"/>
               </w:rPr>
               <w:t>4.4 Charge Limited by Maximum Charge Power</w:t>
-            </w:r>
-          </w:p>
-          <w:p>
-            <w:r>
-              <w:rPr>
-                <w:b/>
-                <w:sz w:val="20"/>
-              </w:rPr>
-              <w:t>Available charging demand exceeds the configured maximum (300 kW).</w:t>
             </w:r>
           </w:p>
         </w:tc>
         <w:tc>
           <w:tcPr>
-            <w:tcW w:type="dxa" w:w="4896"/>
+            <w:tcW w:type="dxa" w:w="3312"/>
           </w:tcPr>
           <w:p>
             <w:r/>
@@ -3663,13 +4164,28 @@
                 <w:b w:val="0"/>
                 <w:sz w:val="20"/>
               </w:rPr>
-              <w:t>Charging limited to 300 kW.</w:t>
+              <w:t>Create available charging demand that exceeds the configured maximum (300 kW).</w:t>
             </w:r>
           </w:p>
         </w:tc>
         <w:tc>
           <w:tcPr>
-            <w:tcW w:type="dxa" w:w="1296"/>
+            <w:tcW w:type="dxa" w:w="3744"/>
+          </w:tcPr>
+          <w:p>
+            <w:r/>
+            <w:r>
+              <w:rPr>
+                <w:b w:val="0"/>
+                <w:sz w:val="20"/>
+              </w:rPr>
+              <w:t>Charging limited to 300 kW.</w:t>
+            </w:r>
+          </w:p>
+        </w:tc>
+        <w:tc>
+          <w:tcPr>
+            <w:tcW w:type="dxa" w:w="1152"/>
           </w:tcPr>
           <w:p>
             <w:pPr>
@@ -3686,7 +4202,7 @@
         </w:tc>
         <w:tc>
           <w:tcPr>
-            <w:tcW w:type="dxa" w:w="1728"/>
+            <w:tcW w:type="dxa" w:w="1440"/>
           </w:tcPr>
           <w:p>
             <w:r/>
@@ -3702,7 +4218,7 @@
       <w:tr>
         <w:tc>
           <w:tcPr>
-            <w:tcW w:type="dxa" w:w="2736"/>
+            <w:tcW w:type="dxa" w:w="2016"/>
           </w:tcPr>
           <w:p>
             <w:r/>
@@ -3712,21 +4228,12 @@
                 <w:sz w:val="20"/>
               </w:rPr>
               <w:t>4.5 Charging Redundancy (grouped)</w:t>
-            </w:r>
-          </w:p>
-          <w:p>
-            <w:r>
-              <w:rPr>
-                <w:b/>
-                <w:sz w:val="20"/>
-              </w:rPr>
-              <w:t>(a) Disable Unit 3; (b) also disable Unit 2; (c) reconnect Unit 3.</w:t>
             </w:r>
           </w:p>
         </w:tc>
         <w:tc>
           <w:tcPr>
-            <w:tcW w:type="dxa" w:w="4896"/>
+            <w:tcW w:type="dxa" w:w="3312"/>
           </w:tcPr>
           <w:p>
             <w:r/>
@@ -3735,7 +4242,7 @@
                 <w:b w:val="0"/>
                 <w:sz w:val="20"/>
               </w:rPr>
-              <w:t>(a) Charging shared equally between Units 1 and 2 only.</w:t>
+              <w:t>(a) Disable Unit 3;</w:t>
             </w:r>
           </w:p>
           <w:p>
@@ -3744,7 +4251,7 @@
                 <w:b w:val="0"/>
                 <w:sz w:val="20"/>
               </w:rPr>
-              <w:t>(b) Remaining battery charges within its limit.</w:t>
+              <w:t>(b) also disable Unit 2;</w:t>
             </w:r>
           </w:p>
           <w:p>
@@ -3753,13 +4260,46 @@
                 <w:b w:val="0"/>
                 <w:sz w:val="20"/>
               </w:rPr>
-              <w:t>(c) Charging redistributed automatically on reconnection.</w:t>
+              <w:t>(c) reconnect Unit 3.</w:t>
             </w:r>
           </w:p>
         </w:tc>
         <w:tc>
           <w:tcPr>
-            <w:tcW w:type="dxa" w:w="1296"/>
+            <w:tcW w:type="dxa" w:w="3744"/>
+          </w:tcPr>
+          <w:p>
+            <w:r/>
+            <w:r>
+              <w:rPr>
+                <w:b w:val="0"/>
+                <w:sz w:val="20"/>
+              </w:rPr>
+              <w:t>(a) Charging shared equally between Units 1 and 2 only.</w:t>
+            </w:r>
+          </w:p>
+          <w:p>
+            <w:r>
+              <w:rPr>
+                <w:b w:val="0"/>
+                <w:sz w:val="20"/>
+              </w:rPr>
+              <w:t>(b) Remaining battery charges within its limit.</w:t>
+            </w:r>
+          </w:p>
+          <w:p>
+            <w:r>
+              <w:rPr>
+                <w:b w:val="0"/>
+                <w:sz w:val="20"/>
+              </w:rPr>
+              <w:t>(c) Charging redistributed automatically on reconnection.</w:t>
+            </w:r>
+          </w:p>
+        </w:tc>
+        <w:tc>
+          <w:tcPr>
+            <w:tcW w:type="dxa" w:w="1152"/>
           </w:tcPr>
           <w:p>
             <w:pPr>
@@ -3776,7 +4316,7 @@
         </w:tc>
         <w:tc>
           <w:tcPr>
-            <w:tcW w:type="dxa" w:w="1728"/>
+            <w:tcW w:type="dxa" w:w="1440"/>
           </w:tcPr>
           <w:p>
             <w:r/>
@@ -3792,7 +4332,7 @@
       <w:tr>
         <w:tc>
           <w:tcPr>
-            <w:tcW w:type="dxa" w:w="2736"/>
+            <w:tcW w:type="dxa" w:w="2016"/>
           </w:tcPr>
           <w:p>
             <w:r/>
@@ -3802,21 +4342,12 @@
                 <w:sz w:val="20"/>
               </w:rPr>
               <w:t>4.6 SOC Balancing While Charging (grouped)</w:t>
-            </w:r>
-          </w:p>
-          <w:p>
-            <w:r>
-              <w:rPr>
-                <w:b/>
-                <w:sz w:val="20"/>
-              </w:rPr>
-              <w:t>(a) SOC 20/45/70%; (b) all SOC = 60%; (c) SOC 100/60/60%.</w:t>
             </w:r>
           </w:p>
         </w:tc>
         <w:tc>
           <w:tcPr>
-            <w:tcW w:type="dxa" w:w="4896"/>
+            <w:tcW w:type="dxa" w:w="3312"/>
           </w:tcPr>
           <w:p>
             <w:r/>
@@ -3825,7 +4356,7 @@
                 <w:b w:val="0"/>
                 <w:sz w:val="20"/>
               </w:rPr>
-              <w:t>(a) PLC prioritizes charging the lower-SOC battery per balancing algorithm.</w:t>
+              <w:t>(a) SOC 20/45/70%;</w:t>
             </w:r>
           </w:p>
           <w:p>
@@ -3834,7 +4365,7 @@
                 <w:b w:val="0"/>
                 <w:sz w:val="20"/>
               </w:rPr>
-              <w:t>(b) Equal charging current.</w:t>
+              <w:t>(b) all SOC = 60%;</w:t>
             </w:r>
           </w:p>
           <w:p>
@@ -3843,13 +4374,46 @@
                 <w:b w:val="0"/>
                 <w:sz w:val="20"/>
               </w:rPr>
-              <w:t>(c) Full battery receives no charge; remaining units continue charging.</w:t>
+              <w:t>(c) SOC 100/60/60%.</w:t>
             </w:r>
           </w:p>
         </w:tc>
         <w:tc>
           <w:tcPr>
-            <w:tcW w:type="dxa" w:w="1296"/>
+            <w:tcW w:type="dxa" w:w="3744"/>
+          </w:tcPr>
+          <w:p>
+            <w:r/>
+            <w:r>
+              <w:rPr>
+                <w:b w:val="0"/>
+                <w:sz w:val="20"/>
+              </w:rPr>
+              <w:t>(a) PLC prioritizes charging the lower-SOC battery per balancing algorithm.</w:t>
+            </w:r>
+          </w:p>
+          <w:p>
+            <w:r>
+              <w:rPr>
+                <w:b w:val="0"/>
+                <w:sz w:val="20"/>
+              </w:rPr>
+              <w:t>(b) Equal charging current.</w:t>
+            </w:r>
+          </w:p>
+          <w:p>
+            <w:r>
+              <w:rPr>
+                <w:b w:val="0"/>
+                <w:sz w:val="20"/>
+              </w:rPr>
+              <w:t>(c) Full battery receives no charge; remaining units continue charging.</w:t>
+            </w:r>
+          </w:p>
+        </w:tc>
+        <w:tc>
+          <w:tcPr>
+            <w:tcW w:type="dxa" w:w="1152"/>
           </w:tcPr>
           <w:p>
             <w:pPr>
@@ -3866,7 +4430,7 @@
         </w:tc>
         <w:tc>
           <w:tcPr>
-            <w:tcW w:type="dxa" w:w="1728"/>
+            <w:tcW w:type="dxa" w:w="1440"/>
           </w:tcPr>
           <w:p>
             <w:r/>
@@ -3882,7 +4446,7 @@
       <w:tr>
         <w:tc>
           <w:tcPr>
-            <w:tcW w:type="dxa" w:w="2736"/>
+            <w:tcW w:type="dxa" w:w="2016"/>
           </w:tcPr>
           <w:p>
             <w:r/>
@@ -3892,21 +4456,12 @@
                 <w:sz w:val="20"/>
               </w:rPr>
               <w:t>4.7 Fault Handling While Charging (grouped)</w:t>
-            </w:r>
-          </w:p>
-          <w:p>
-            <w:r>
-              <w:rPr>
-                <w:b/>
-                <w:sz w:val="20"/>
-              </w:rPr>
-              <w:t>(a) Trip Unit 1; (b) disconnect grid meter; (c) restart PLC; (d) disconnect and reconnect one unit's communication.</w:t>
             </w:r>
           </w:p>
         </w:tc>
         <w:tc>
           <w:tcPr>
-            <w:tcW w:type="dxa" w:w="4896"/>
+            <w:tcW w:type="dxa" w:w="3312"/>
           </w:tcPr>
           <w:p>
             <w:r/>
@@ -3915,7 +4470,7 @@
                 <w:b w:val="0"/>
                 <w:sz w:val="20"/>
               </w:rPr>
-              <w:t>(a) Remaining units continue charging.</w:t>
+              <w:t>(a) Trip Unit 1;</w:t>
             </w:r>
           </w:p>
           <w:p>
@@ -3924,7 +4479,7 @@
                 <w:b w:val="0"/>
                 <w:sz w:val="20"/>
               </w:rPr>
-              <w:t>(b) Charging stops or enters fallback (power-meter fixed power), alarm generated.</w:t>
+              <w:t>(b) disconnect grid meter;</w:t>
             </w:r>
           </w:p>
           <w:p>
@@ -3933,7 +4488,7 @@
                 <w:b w:val="0"/>
                 <w:sz w:val="20"/>
               </w:rPr>
-              <w:t>(c) System returns to Idle Charging after initialization.</w:t>
+              <w:t>(c) restart PLC;</w:t>
             </w:r>
           </w:p>
           <w:p>
@@ -3942,13 +4497,55 @@
                 <w:b w:val="0"/>
                 <w:sz w:val="20"/>
               </w:rPr>
-              <w:t>(d) Affected unit stops charging during comm loss and automatically rejoins the charging group after recovery.</w:t>
+              <w:t>(d) disconnect and reconnect one unit's communication.</w:t>
             </w:r>
           </w:p>
         </w:tc>
         <w:tc>
           <w:tcPr>
-            <w:tcW w:type="dxa" w:w="1296"/>
+            <w:tcW w:type="dxa" w:w="3744"/>
+          </w:tcPr>
+          <w:p>
+            <w:r/>
+            <w:r>
+              <w:rPr>
+                <w:b w:val="0"/>
+                <w:sz w:val="20"/>
+              </w:rPr>
+              <w:t>(a) Remaining units continue charging.</w:t>
+            </w:r>
+          </w:p>
+          <w:p>
+            <w:r>
+              <w:rPr>
+                <w:b w:val="0"/>
+                <w:sz w:val="20"/>
+              </w:rPr>
+              <w:t>(b) Charging stops or enters fallback (power-meter fixed power), alarm generated.</w:t>
+            </w:r>
+          </w:p>
+          <w:p>
+            <w:r>
+              <w:rPr>
+                <w:b w:val="0"/>
+                <w:sz w:val="20"/>
+              </w:rPr>
+              <w:t>(c) System returns to Idle Charging after initialization.</w:t>
+            </w:r>
+          </w:p>
+          <w:p>
+            <w:r>
+              <w:rPr>
+                <w:b w:val="0"/>
+                <w:sz w:val="20"/>
+              </w:rPr>
+              <w:t>(d) Affected unit stops charging during comm loss and automatically rejoins the charging group after recovery.</w:t>
+            </w:r>
+          </w:p>
+        </w:tc>
+        <w:tc>
+          <w:tcPr>
+            <w:tcW w:type="dxa" w:w="1152"/>
           </w:tcPr>
           <w:p>
             <w:pPr>
@@ -3965,7 +4562,7 @@
         </w:tc>
         <w:tc>
           <w:tcPr>
-            <w:tcW w:type="dxa" w:w="1728"/>
+            <w:tcW w:type="dxa" w:w="1440"/>
           </w:tcPr>
           <w:p>
             <w:r/>
@@ -3981,7 +4578,7 @@
       <w:tr>
         <w:tc>
           <w:tcPr>
-            <w:tcW w:type="dxa" w:w="2736"/>
+            <w:tcW w:type="dxa" w:w="2016"/>
           </w:tcPr>
           <w:p>
             <w:r/>
@@ -3991,21 +4588,12 @@
                 <w:sz w:val="20"/>
               </w:rPr>
               <w:t>4.8 Charge Ramp Verification</w:t>
-            </w:r>
-          </w:p>
-          <w:p>
-            <w:r>
-              <w:rPr>
-                <w:b/>
-                <w:sz w:val="20"/>
-              </w:rPr>
-              <w:t>Command Idle Charging from 0 kW to configured maximum charge power.</w:t>
             </w:r>
           </w:p>
         </w:tc>
         <w:tc>
           <w:tcPr>
-            <w:tcW w:type="dxa" w:w="4896"/>
+            <w:tcW w:type="dxa" w:w="3312"/>
           </w:tcPr>
           <w:p>
             <w:r/>
@@ -4014,13 +4602,28 @@
                 <w:b w:val="0"/>
                 <w:sz w:val="20"/>
               </w:rPr>
-              <w:t>Charge power follows the configured ramp rate with no overshoot or oscillation.</w:t>
+              <w:t>Command Idle Charging from 0 kW to configured maximum charge power.</w:t>
             </w:r>
           </w:p>
         </w:tc>
         <w:tc>
           <w:tcPr>
-            <w:tcW w:type="dxa" w:w="1296"/>
+            <w:tcW w:type="dxa" w:w="3744"/>
+          </w:tcPr>
+          <w:p>
+            <w:r/>
+            <w:r>
+              <w:rPr>
+                <w:b w:val="0"/>
+                <w:sz w:val="20"/>
+              </w:rPr>
+              <w:t>Charge power follows the configured ramp rate with no overshoot or oscillation.</w:t>
+            </w:r>
+          </w:p>
+        </w:tc>
+        <w:tc>
+          <w:tcPr>
+            <w:tcW w:type="dxa" w:w="1152"/>
           </w:tcPr>
           <w:p>
             <w:pPr>
@@ -4037,7 +4640,7 @@
         </w:tc>
         <w:tc>
           <w:tcPr>
-            <w:tcW w:type="dxa" w:w="1728"/>
+            <w:tcW w:type="dxa" w:w="1440"/>
           </w:tcPr>
           <w:p>
             <w:r/>
@@ -4053,7 +4656,7 @@
       <w:tr>
         <w:tc>
           <w:tcPr>
-            <w:tcW w:type="dxa" w:w="2736"/>
+            <w:tcW w:type="dxa" w:w="2016"/>
           </w:tcPr>
           <w:p>
             <w:r/>
@@ -4063,21 +4666,12 @@
                 <w:sz w:val="20"/>
               </w:rPr>
               <w:t>4.9 Mode Transitions (grouped)</w:t>
-            </w:r>
-          </w:p>
-          <w:p>
-            <w:r>
-              <w:rPr>
-                <w:b/>
-                <w:sz w:val="20"/>
-              </w:rPr>
-              <w:t>(a) Disable Idle Charging while charging; (b) disable Peak Shaving while Idle Charging active; (c) power-cycle the PLC; (d) switch to Manual Mode (disable Peakshave first) and command discharge.</w:t>
             </w:r>
           </w:p>
         </w:tc>
         <w:tc>
           <w:tcPr>
-            <w:tcW w:type="dxa" w:w="4896"/>
+            <w:tcW w:type="dxa" w:w="3312"/>
           </w:tcPr>
           <w:p>
             <w:r/>
@@ -4086,7 +4680,7 @@
                 <w:b w:val="0"/>
                 <w:sz w:val="20"/>
               </w:rPr>
-              <w:t>(a) Charging stops; Peak Shaving remains enabled.</w:t>
+              <w:t>(a) Disable Idle Charging while charging;</w:t>
             </w:r>
           </w:p>
           <w:p>
@@ -4095,7 +4689,7 @@
                 <w:b w:val="0"/>
                 <w:sz w:val="20"/>
               </w:rPr>
-              <w:t>(b) System follows configured behaviour (charging stops or changes to Manual if selected).</w:t>
+              <w:t>(b) disable Peak Shaving while Idle Charging active;</w:t>
             </w:r>
           </w:p>
           <w:p>
@@ -4104,7 +4698,7 @@
                 <w:b w:val="0"/>
                 <w:sz w:val="20"/>
               </w:rPr>
-              <w:t>(c) System restores previous configuration; Idle Charging resumes if required.</w:t>
+              <w:t>(c) power-cycle the PLC;</w:t>
             </w:r>
           </w:p>
           <w:p>
@@ -4113,13 +4707,55 @@
                 <w:b w:val="0"/>
                 <w:sz w:val="20"/>
               </w:rPr>
-              <w:t>(d) Idle Charging cancelled, Manual Mode active, requested power achieved smoothly per configured ramp rate.</w:t>
+              <w:t>(d) switch to Manual Mode (disable Peakshave first) and command discharge.</w:t>
             </w:r>
           </w:p>
         </w:tc>
         <w:tc>
           <w:tcPr>
-            <w:tcW w:type="dxa" w:w="1296"/>
+            <w:tcW w:type="dxa" w:w="3744"/>
+          </w:tcPr>
+          <w:p>
+            <w:r/>
+            <w:r>
+              <w:rPr>
+                <w:b w:val="0"/>
+                <w:sz w:val="20"/>
+              </w:rPr>
+              <w:t>(a) Charging stops; Peak Shaving remains enabled.</w:t>
+            </w:r>
+          </w:p>
+          <w:p>
+            <w:r>
+              <w:rPr>
+                <w:b w:val="0"/>
+                <w:sz w:val="20"/>
+              </w:rPr>
+              <w:t>(b) System follows configured behaviour (charging stops or changes to Manual if selected).</w:t>
+            </w:r>
+          </w:p>
+          <w:p>
+            <w:r>
+              <w:rPr>
+                <w:b w:val="0"/>
+                <w:sz w:val="20"/>
+              </w:rPr>
+              <w:t>(c) System restores previous configuration; Idle Charging resumes if required.</w:t>
+            </w:r>
+          </w:p>
+          <w:p>
+            <w:r>
+              <w:rPr>
+                <w:b w:val="0"/>
+                <w:sz w:val="20"/>
+              </w:rPr>
+              <w:t>(d) Idle Charging cancelled, Manual Mode active, requested power achieved smoothly per configured ramp rate.</w:t>
+            </w:r>
+          </w:p>
+        </w:tc>
+        <w:tc>
+          <w:tcPr>
+            <w:tcW w:type="dxa" w:w="1152"/>
           </w:tcPr>
           <w:p>
             <w:pPr>
@@ -4136,7 +4772,7 @@
         </w:tc>
         <w:tc>
           <w:tcPr>
-            <w:tcW w:type="dxa" w:w="1728"/>
+            <w:tcW w:type="dxa" w:w="1440"/>
           </w:tcPr>
           <w:p>
             <w:r/>

</xml_diff>